<commit_message>
Module 1 v3: runthrough — five defects corrected
1. Root Law de-parameterised: R = A*k!, not R = a*k!*d^k. The step and the
   multiplier are one knob, not two — scaling inside the power and stepping
   the Prime String produce the same string term for term (verified).
2. Definitional error: 3n^2+5n+7 was called a Base String. It is not one;
   a Base String is exactly (P_n)^k. Caution added, language corrected.
3. Inclusion-exclusion step in the counting proof was asserted rather than
   shown. Full worked case at k=2 added: all placements listed, the
   inclusion-exclusion performed, the formula evaluated, all three agree.
4. Order k described loosely as 'an operation of order k'. It is a power.
5. Index vs position pinned down: B^2(4) = 16, index 4 is the fifth term.

Co-Authored-By: Claude Opus 5 (1M context) <noreply@anthropic.com>
Claude-Session: https://claude.ai/code/session_01PfEdt2X3ayB4TeJ7gNfzUn
</commit_message>
<xml_diff>
--- a/String Mathematics/Syllabus-Learning/module-1/String-Mathematics-Module-1-Foundations.docx
+++ b/String Mathematics/Syllabus-Learning/module-1/String-Mathematics-Module-1-Foundations.docx
@@ -175,7 +175,7 @@
         <w:t xml:space="preserve"> </w:t>
       </w:r>
       <w:r>
-        <w:t xml:space="preserve">2</w:t>
+        <w:t xml:space="preserve">3</w:t>
       </w:r>
     </w:p>
     <w:sdt>
@@ -231,13 +231,13 @@
           <w:bCs/>
           <w:b/>
         </w:rPr>
-        <w:t xml:space="preserve">Version 2.</w:t>
-      </w:r>
-      <w:r>
-        <w:t xml:space="preserve"> </w:t>
-      </w:r>
-      <w:r>
-        <w:t xml:space="preserve">See §16 for the revision history and what changed from Version 1.</w:t>
+        <w:t xml:space="preserve">Version 3.</w:t>
+      </w:r>
+      <w:r>
+        <w:t xml:space="preserve"> </w:t>
+      </w:r>
+      <w:r>
+        <w:t xml:space="preserve">See §16 for the revision history.</w:t>
       </w:r>
     </w:p>
     <w:p>
@@ -1240,8 +1240,62 @@
               <w:jc w:val="left"/>
             </w:pPr>
             <w:r>
-              <w:t xml:space="preserve">The order of the operation applied to build the Base String</w:t>
-            </w:r>
+              <w:t xml:space="preserve">The power each Prime value is raised to:</w:t>
+            </w:r>
+            <w:r>
+              <w:t xml:space="preserve"> </w:t>
+            </w:r>
+            <m:oMath>
+              <m:sSub>
+                <m:e>
+                  <m:r>
+                    <m:t>B</m:t>
+                  </m:r>
+                </m:e>
+                <m:sub>
+                  <m:r>
+                    <m:t>n</m:t>
+                  </m:r>
+                </m:sub>
+              </m:sSub>
+              <m:r>
+                <m:rPr>
+                  <m:sty m:val="p"/>
+                </m:rPr>
+                <m:t>=</m:t>
+              </m:r>
+              <m:sSup>
+                <m:e>
+                  <m:d>
+                    <m:dPr>
+                      <m:begChr m:val="("/>
+                      <m:endChr m:val=")"/>
+                      <m:sepChr m:val=""/>
+                      <m:grow/>
+                    </m:dPr>
+                    <m:e>
+                      <m:sSub>
+                        <m:e>
+                          <m:r>
+                            <m:t>P</m:t>
+                          </m:r>
+                        </m:e>
+                        <m:sub>
+                          <m:r>
+                            <m:t>n</m:t>
+                          </m:r>
+                        </m:sub>
+                      </m:sSub>
+                    </m:e>
+                  </m:d>
+                </m:e>
+                <m:sup>
+                  <m:r>
+                    <m:t>k</m:t>
+                  </m:r>
+                </m:sup>
+              </m:sSup>
+            </m:oMath>
           </w:p>
         </w:tc>
       </w:tr>
@@ -1846,7 +1900,7 @@
               <w:jc w:val="left"/>
             </w:pPr>
             <w:r>
-              <w:t xml:space="preserve">The Prime String with an operation of order</w:t>
+              <w:t xml:space="preserve">Each Prime value raised to the</w:t>
             </w:r>
             <w:r>
               <w:t xml:space="preserve"> </w:t>
@@ -1857,11 +1911,62 @@
               </m:r>
             </m:oMath>
             <w:r>
+              <w:t xml:space="preserve">-th power:</w:t>
+            </w:r>
+            <w:r>
               <w:t xml:space="preserve"> </w:t>
             </w:r>
-            <w:r>
-              <w:t xml:space="preserve">applied to each term</w:t>
-            </w:r>
+            <m:oMath>
+              <m:sSub>
+                <m:e>
+                  <m:r>
+                    <m:t>B</m:t>
+                  </m:r>
+                </m:e>
+                <m:sub>
+                  <m:r>
+                    <m:t>n</m:t>
+                  </m:r>
+                </m:sub>
+              </m:sSub>
+              <m:r>
+                <m:rPr>
+                  <m:sty m:val="p"/>
+                </m:rPr>
+                <m:t>=</m:t>
+              </m:r>
+              <m:sSup>
+                <m:e>
+                  <m:d>
+                    <m:dPr>
+                      <m:begChr m:val="("/>
+                      <m:endChr m:val=")"/>
+                      <m:sepChr m:val=""/>
+                      <m:grow/>
+                    </m:dPr>
+                    <m:e>
+                      <m:sSub>
+                        <m:e>
+                          <m:r>
+                            <m:t>P</m:t>
+                          </m:r>
+                        </m:e>
+                        <m:sub>
+                          <m:r>
+                            <m:t>n</m:t>
+                          </m:r>
+                        </m:sub>
+                      </m:sSub>
+                    </m:e>
+                  </m:d>
+                </m:e>
+                <m:sup>
+                  <m:r>
+                    <m:t>k</m:t>
+                  </m:r>
+                </m:sup>
+              </m:sSup>
+            </m:oMath>
           </w:p>
         </w:tc>
       </w:tr>
@@ -1940,6 +2045,229 @@
         </w:tc>
       </w:tr>
     </w:tbl>
+    <w:p>
+      <w:pPr>
+        <w:pStyle w:val="BodyText"/>
+      </w:pPr>
+      <w:r>
+        <w:rPr>
+          <w:bCs/>
+          <w:b/>
+        </w:rPr>
+        <w:t xml:space="preserve">Read the Base String symbol concretely.</w:t>
+      </w:r>
+      <w:r>
+        <w:t xml:space="preserve"> </w:t>
+      </w:r>
+      <m:oMath>
+        <m:sSup>
+          <m:e>
+            <m:r>
+              <m:t>B</m:t>
+            </m:r>
+          </m:e>
+          <m:sup>
+            <m:r>
+              <m:t>2</m:t>
+            </m:r>
+          </m:sup>
+        </m:sSup>
+        <m:d>
+          <m:dPr>
+            <m:begChr m:val="("/>
+            <m:endChr m:val=")"/>
+            <m:sepChr m:val=""/>
+            <m:grow/>
+          </m:dPr>
+          <m:e>
+            <m:r>
+              <m:t>4</m:t>
+            </m:r>
+          </m:e>
+        </m:d>
+      </m:oMath>
+      <w:r>
+        <w:t xml:space="preserve"> </w:t>
+      </w:r>
+      <w:r>
+        <w:t xml:space="preserve">means: take the term at</w:t>
+      </w:r>
+      <w:r>
+        <w:t xml:space="preserve"> </w:t>
+      </w:r>
+      <w:r>
+        <w:rPr>
+          <w:bCs/>
+          <w:b/>
+        </w:rPr>
+        <w:t xml:space="preserve">index 4</w:t>
+      </w:r>
+      <w:r>
+        <w:t xml:space="preserve"> </w:t>
+      </w:r>
+      <w:r>
+        <w:t xml:space="preserve">of the Prime String, and square it. With the regular whole-integer Prime String that term is</w:t>
+      </w:r>
+      <w:r>
+        <w:t xml:space="preserve"> </w:t>
+      </w:r>
+      <m:oMath>
+        <m:r>
+          <m:t>4</m:t>
+        </m:r>
+      </m:oMath>
+      <w:r>
+        <w:t xml:space="preserve">, so</w:t>
+      </w:r>
+      <w:r>
+        <w:t xml:space="preserve"> </w:t>
+      </w:r>
+      <m:oMath>
+        <m:sSup>
+          <m:e>
+            <m:r>
+              <m:t>B</m:t>
+            </m:r>
+          </m:e>
+          <m:sup>
+            <m:r>
+              <m:t>2</m:t>
+            </m:r>
+          </m:sup>
+        </m:sSup>
+        <m:d>
+          <m:dPr>
+            <m:begChr m:val="("/>
+            <m:endChr m:val=")"/>
+            <m:sepChr m:val=""/>
+            <m:grow/>
+          </m:dPr>
+          <m:e>
+            <m:r>
+              <m:t>4</m:t>
+            </m:r>
+          </m:e>
+        </m:d>
+        <m:r>
+          <m:rPr>
+            <m:sty m:val="p"/>
+          </m:rPr>
+          <m:t>=</m:t>
+        </m:r>
+        <m:r>
+          <m:t>16</m:t>
+        </m:r>
+      </m:oMath>
+      <w:r>
+        <w:t xml:space="preserve">.</w:t>
+      </w:r>
+    </w:p>
+    <w:p>
+      <w:pPr>
+        <w:pStyle w:val="BodyText"/>
+      </w:pPr>
+      <w:r>
+        <w:rPr>
+          <w:bCs/>
+          <w:b/>
+        </w:rPr>
+        <w:t xml:space="preserve">Index, not position.</w:t>
+      </w:r>
+      <w:r>
+        <w:t xml:space="preserve"> </w:t>
+      </w:r>
+      <w:r>
+        <w:t xml:space="preserve">Because indexing starts at</w:t>
+      </w:r>
+      <w:r>
+        <w:t xml:space="preserve"> </w:t>
+      </w:r>
+      <m:oMath>
+        <m:r>
+          <m:t>n</m:t>
+        </m:r>
+        <m:r>
+          <m:rPr>
+            <m:sty m:val="p"/>
+          </m:rPr>
+          <m:t>=</m:t>
+        </m:r>
+        <m:r>
+          <m:t>0</m:t>
+        </m:r>
+      </m:oMath>
+      <w:r>
+        <w:t xml:space="preserve"> </w:t>
+      </w:r>
+      <w:r>
+        <w:t xml:space="preserve">(§2.4),</w:t>
+      </w:r>
+      <w:r>
+        <w:t xml:space="preserve"> </w:t>
+      </w:r>
+      <w:r>
+        <w:t xml:space="preserve">“</w:t>
+      </w:r>
+      <w:r>
+        <w:t xml:space="preserve">index 4</w:t>
+      </w:r>
+      <w:r>
+        <w:t xml:space="preserve">”</w:t>
+      </w:r>
+      <w:r>
+        <w:t xml:space="preserve"> </w:t>
+      </w:r>
+      <w:r>
+        <w:t xml:space="preserve">is the</w:t>
+      </w:r>
+      <w:r>
+        <w:t xml:space="preserve"> </w:t>
+      </w:r>
+      <w:r>
+        <w:rPr>
+          <w:iCs/>
+          <w:i/>
+        </w:rPr>
+        <w:t xml:space="preserve">fifth</w:t>
+      </w:r>
+      <w:r>
+        <w:t xml:space="preserve"> </w:t>
+      </w:r>
+      <w:r>
+        <w:t xml:space="preserve">term written down. The phrase</w:t>
+      </w:r>
+      <w:r>
+        <w:t xml:space="preserve"> </w:t>
+      </w:r>
+      <w:r>
+        <w:t xml:space="preserve">“</w:t>
+      </w:r>
+      <w:r>
+        <w:t xml:space="preserve">the 4th term</w:t>
+      </w:r>
+      <w:r>
+        <w:t xml:space="preserve">”</w:t>
+      </w:r>
+      <w:r>
+        <w:t xml:space="preserve"> </w:t>
+      </w:r>
+      <w:r>
+        <w:t xml:space="preserve">is ambiguous in ordinary English and is avoided throughout this syllabus — always say</w:t>
+      </w:r>
+      <w:r>
+        <w:t xml:space="preserve"> </w:t>
+      </w:r>
+      <w:r>
+        <w:rPr>
+          <w:bCs/>
+          <w:b/>
+        </w:rPr>
+        <w:t xml:space="preserve">index</w:t>
+      </w:r>
+      <w:r>
+        <w:t xml:space="preserve">.</w:t>
+      </w:r>
+    </w:p>
     <w:bookmarkEnd w:id="28"/>
     <w:bookmarkStart w:id="29" w:name="the-indexing-convention"/>
     <w:p>
@@ -12322,6 +12650,721 @@
           <w:bCs/>
           <w:b/>
         </w:rPr>
+        <w:t xml:space="preserve">That step is the one place this proof asks you to take something on trust, so here it is worked out in full at</w:t>
+      </w:r>
+      <w:r>
+        <w:rPr>
+          <w:bCs/>
+          <w:b/>
+        </w:rPr>
+        <w:t xml:space="preserve"> </w:t>
+      </w:r>
+      <m:oMath>
+        <m:r>
+          <m:t>k</m:t>
+        </m:r>
+        <m:r>
+          <m:rPr>
+            <m:sty m:val="p"/>
+          </m:rPr>
+          <m:t>=</m:t>
+        </m:r>
+        <m:r>
+          <m:t>2</m:t>
+        </m:r>
+      </m:oMath>
+      <w:r>
+        <w:t xml:space="preserve"> </w:t>
+      </w:r>
+      <w:r>
+        <w:t xml:space="preserve">— small enough to check by listing every case.</w:t>
+      </w:r>
+    </w:p>
+    <w:p>
+      <w:pPr>
+        <w:pStyle w:val="BodyText"/>
+      </w:pPr>
+      <w:r>
+        <w:t xml:space="preserve">Two balls</w:t>
+      </w:r>
+      <w:r>
+        <w:t xml:space="preserve"> </w:t>
+      </w:r>
+      <m:oMath>
+        <m:r>
+          <m:rPr>
+            <m:sty m:val="p"/>
+          </m:rPr>
+          <m:t>{</m:t>
+        </m:r>
+        <m:r>
+          <m:t>1</m:t>
+        </m:r>
+        <m:r>
+          <m:rPr>
+            <m:sty m:val="p"/>
+          </m:rPr>
+          <m:t>,</m:t>
+        </m:r>
+        <m:r>
+          <m:t>2</m:t>
+        </m:r>
+        <m:r>
+          <m:rPr>
+            <m:sty m:val="p"/>
+          </m:rPr>
+          <m:t>}</m:t>
+        </m:r>
+      </m:oMath>
+      <w:r>
+        <w:t xml:space="preserve">, two boxes</w:t>
+      </w:r>
+      <w:r>
+        <w:t xml:space="preserve"> </w:t>
+      </w:r>
+      <m:oMath>
+        <m:r>
+          <m:rPr>
+            <m:sty m:val="p"/>
+          </m:rPr>
+          <m:t>{</m:t>
+        </m:r>
+        <m:r>
+          <m:t>A</m:t>
+        </m:r>
+        <m:r>
+          <m:rPr>
+            <m:sty m:val="p"/>
+          </m:rPr>
+          <m:t>,</m:t>
+        </m:r>
+        <m:r>
+          <m:t>B</m:t>
+        </m:r>
+        <m:r>
+          <m:rPr>
+            <m:sty m:val="p"/>
+          </m:rPr>
+          <m:t>}</m:t>
+        </m:r>
+      </m:oMath>
+      <w:r>
+        <w:t xml:space="preserve">. All possible placements:</w:t>
+      </w:r>
+    </w:p>
+    <w:tbl>
+      <w:tblPr>
+        <w:tblStyle w:val="Table"/>
+        <w:tblW w:type="auto" w:w="0"/>
+        <w:tblLook w:firstRow="1" w:lastRow="0" w:firstColumn="0" w:lastColumn="0" w:noHBand="0" w:noVBand="0" w:val="0020"/>
+        <w:jc w:val="start"/>
+      </w:tblPr>
+      <w:tblGrid>
+        <w:gridCol w:w="1980"/>
+        <w:gridCol w:w="1980"/>
+        <w:gridCol w:w="1980"/>
+        <w:gridCol w:w="1980"/>
+      </w:tblGrid>
+      <w:tr>
+        <w:trPr>
+          <w:tblHeader w:val="true"/>
+        </w:trPr>
+        <w:tc>
+          <w:tcPr/>
+          <w:p>
+            <w:pPr>
+              <w:pStyle w:val="Compact"/>
+            </w:pPr>
+          </w:p>
+        </w:tc>
+        <w:tc>
+          <w:tcPr/>
+          <w:p>
+            <w:pPr>
+              <w:pStyle w:val="Compact"/>
+              <w:jc w:val="left"/>
+            </w:pPr>
+            <w:r>
+              <w:t xml:space="preserve">ball 1</w:t>
+            </w:r>
+          </w:p>
+        </w:tc>
+        <w:tc>
+          <w:tcPr/>
+          <w:p>
+            <w:pPr>
+              <w:pStyle w:val="Compact"/>
+              <w:jc w:val="left"/>
+            </w:pPr>
+            <w:r>
+              <w:t xml:space="preserve">ball 2</w:t>
+            </w:r>
+          </w:p>
+        </w:tc>
+        <w:tc>
+          <w:tcPr/>
+          <w:p>
+            <w:pPr>
+              <w:pStyle w:val="Compact"/>
+              <w:jc w:val="left"/>
+            </w:pPr>
+            <w:r>
+              <w:t xml:space="preserve">every box used?</w:t>
+            </w:r>
+          </w:p>
+        </w:tc>
+      </w:tr>
+      <w:tr>
+        <w:tc>
+          <w:tcPr/>
+          <w:p>
+            <w:pPr>
+              <w:pStyle w:val="Compact"/>
+              <w:jc w:val="left"/>
+            </w:pPr>
+            <w:r>
+              <w:t xml:space="preserve">1</w:t>
+            </w:r>
+          </w:p>
+        </w:tc>
+        <w:tc>
+          <w:tcPr/>
+          <w:p>
+            <w:pPr>
+              <w:pStyle w:val="Compact"/>
+              <w:jc w:val="left"/>
+            </w:pPr>
+            <w:r>
+              <w:t xml:space="preserve">A</w:t>
+            </w:r>
+          </w:p>
+        </w:tc>
+        <w:tc>
+          <w:tcPr/>
+          <w:p>
+            <w:pPr>
+              <w:pStyle w:val="Compact"/>
+              <w:jc w:val="left"/>
+            </w:pPr>
+            <w:r>
+              <w:t xml:space="preserve">A</w:t>
+            </w:r>
+          </w:p>
+        </w:tc>
+        <w:tc>
+          <w:tcPr/>
+          <w:p>
+            <w:pPr>
+              <w:pStyle w:val="Compact"/>
+              <w:jc w:val="left"/>
+            </w:pPr>
+            <w:r>
+              <w:t xml:space="preserve">no — B is empty</w:t>
+            </w:r>
+          </w:p>
+        </w:tc>
+      </w:tr>
+      <w:tr>
+        <w:tc>
+          <w:tcPr/>
+          <w:p>
+            <w:pPr>
+              <w:pStyle w:val="Compact"/>
+              <w:jc w:val="left"/>
+            </w:pPr>
+            <w:r>
+              <w:t xml:space="preserve">2</w:t>
+            </w:r>
+          </w:p>
+        </w:tc>
+        <w:tc>
+          <w:tcPr/>
+          <w:p>
+            <w:pPr>
+              <w:pStyle w:val="Compact"/>
+              <w:jc w:val="left"/>
+            </w:pPr>
+            <w:r>
+              <w:t xml:space="preserve">A</w:t>
+            </w:r>
+          </w:p>
+        </w:tc>
+        <w:tc>
+          <w:tcPr/>
+          <w:p>
+            <w:pPr>
+              <w:pStyle w:val="Compact"/>
+              <w:jc w:val="left"/>
+            </w:pPr>
+            <w:r>
+              <w:t xml:space="preserve">B</w:t>
+            </w:r>
+          </w:p>
+        </w:tc>
+        <w:tc>
+          <w:tcPr/>
+          <w:p>
+            <w:pPr>
+              <w:pStyle w:val="Compact"/>
+              <w:jc w:val="left"/>
+            </w:pPr>
+            <w:r>
+              <w:rPr>
+                <w:bCs/>
+                <w:b/>
+              </w:rPr>
+              <w:t xml:space="preserve">yes</w:t>
+            </w:r>
+          </w:p>
+        </w:tc>
+      </w:tr>
+      <w:tr>
+        <w:tc>
+          <w:tcPr/>
+          <w:p>
+            <w:pPr>
+              <w:pStyle w:val="Compact"/>
+              <w:jc w:val="left"/>
+            </w:pPr>
+            <w:r>
+              <w:t xml:space="preserve">3</w:t>
+            </w:r>
+          </w:p>
+        </w:tc>
+        <w:tc>
+          <w:tcPr/>
+          <w:p>
+            <w:pPr>
+              <w:pStyle w:val="Compact"/>
+              <w:jc w:val="left"/>
+            </w:pPr>
+            <w:r>
+              <w:t xml:space="preserve">B</w:t>
+            </w:r>
+          </w:p>
+        </w:tc>
+        <w:tc>
+          <w:tcPr/>
+          <w:p>
+            <w:pPr>
+              <w:pStyle w:val="Compact"/>
+              <w:jc w:val="left"/>
+            </w:pPr>
+            <w:r>
+              <w:t xml:space="preserve">A</w:t>
+            </w:r>
+          </w:p>
+        </w:tc>
+        <w:tc>
+          <w:tcPr/>
+          <w:p>
+            <w:pPr>
+              <w:pStyle w:val="Compact"/>
+              <w:jc w:val="left"/>
+            </w:pPr>
+            <w:r>
+              <w:rPr>
+                <w:bCs/>
+                <w:b/>
+              </w:rPr>
+              <w:t xml:space="preserve">yes</w:t>
+            </w:r>
+          </w:p>
+        </w:tc>
+      </w:tr>
+      <w:tr>
+        <w:tc>
+          <w:tcPr/>
+          <w:p>
+            <w:pPr>
+              <w:pStyle w:val="Compact"/>
+              <w:jc w:val="left"/>
+            </w:pPr>
+            <w:r>
+              <w:t xml:space="preserve">4</w:t>
+            </w:r>
+          </w:p>
+        </w:tc>
+        <w:tc>
+          <w:tcPr/>
+          <w:p>
+            <w:pPr>
+              <w:pStyle w:val="Compact"/>
+              <w:jc w:val="left"/>
+            </w:pPr>
+            <w:r>
+              <w:t xml:space="preserve">B</w:t>
+            </w:r>
+          </w:p>
+        </w:tc>
+        <w:tc>
+          <w:tcPr/>
+          <w:p>
+            <w:pPr>
+              <w:pStyle w:val="Compact"/>
+              <w:jc w:val="left"/>
+            </w:pPr>
+            <w:r>
+              <w:t xml:space="preserve">B</w:t>
+            </w:r>
+          </w:p>
+        </w:tc>
+        <w:tc>
+          <w:tcPr/>
+          <w:p>
+            <w:pPr>
+              <w:pStyle w:val="Compact"/>
+              <w:jc w:val="left"/>
+            </w:pPr>
+            <w:r>
+              <w:t xml:space="preserve">no — A is empty</w:t>
+            </w:r>
+          </w:p>
+        </w:tc>
+      </w:tr>
+    </w:tbl>
+    <w:p>
+      <w:pPr>
+        <w:pStyle w:val="BodyText"/>
+      </w:pPr>
+      <w:r>
+        <w:t xml:space="preserve">Four placements,</w:t>
+      </w:r>
+      <w:r>
+        <w:t xml:space="preserve"> </w:t>
+      </w:r>
+      <w:r>
+        <w:rPr>
+          <w:bCs/>
+          <w:b/>
+        </w:rPr>
+        <w:t xml:space="preserve">two</w:t>
+      </w:r>
+      <w:r>
+        <w:t xml:space="preserve"> </w:t>
+      </w:r>
+      <w:r>
+        <w:t xml:space="preserve">of which use every box.</w:t>
+      </w:r>
+    </w:p>
+    <w:p>
+      <w:pPr>
+        <w:pStyle w:val="BodyText"/>
+      </w:pPr>
+      <w:r>
+        <w:t xml:space="preserve">Now the inclusion–exclusion count: start with all</w:t>
+      </w:r>
+      <w:r>
+        <w:t xml:space="preserve"> </w:t>
+      </w:r>
+      <m:oMath>
+        <m:sSup>
+          <m:e>
+            <m:r>
+              <m:t>2</m:t>
+            </m:r>
+          </m:e>
+          <m:sup>
+            <m:r>
+              <m:t>2</m:t>
+            </m:r>
+          </m:sup>
+        </m:sSup>
+        <m:r>
+          <m:rPr>
+            <m:sty m:val="p"/>
+          </m:rPr>
+          <m:t>=</m:t>
+        </m:r>
+        <m:r>
+          <m:t>4</m:t>
+        </m:r>
+      </m:oMath>
+      <w:r>
+        <w:t xml:space="preserve"> </w:t>
+      </w:r>
+      <w:r>
+        <w:t xml:space="preserve">placements; subtract the ones that miss at least one box — there are</w:t>
+      </w:r>
+      <w:r>
+        <w:t xml:space="preserve"> </w:t>
+      </w:r>
+      <m:oMath>
+        <m:d>
+          <m:dPr>
+            <m:begChr m:val="("/>
+            <m:endChr m:val=")"/>
+            <m:sepChr m:val=""/>
+            <m:grow/>
+          </m:dPr>
+          <m:e>
+            <m:f>
+              <m:fPr>
+                <m:type m:val="noBar"/>
+              </m:fPr>
+              <m:num>
+                <m:r>
+                  <m:t>2</m:t>
+                </m:r>
+              </m:num>
+              <m:den>
+                <m:r>
+                  <m:t>1</m:t>
+                </m:r>
+              </m:den>
+            </m:f>
+          </m:e>
+        </m:d>
+        <m:r>
+          <m:rPr>
+            <m:sty m:val="p"/>
+          </m:rPr>
+          <m:t>=</m:t>
+        </m:r>
+        <m:r>
+          <m:t>2</m:t>
+        </m:r>
+      </m:oMath>
+      <w:r>
+        <w:t xml:space="preserve"> </w:t>
+      </w:r>
+      <w:r>
+        <w:t xml:space="preserve">boxes that could be the sole survivor, and</w:t>
+      </w:r>
+      <w:r>
+        <w:t xml:space="preserve"> </w:t>
+      </w:r>
+      <m:oMath>
+        <m:sSup>
+          <m:e>
+            <m:r>
+              <m:t>1</m:t>
+            </m:r>
+          </m:e>
+          <m:sup>
+            <m:r>
+              <m:t>2</m:t>
+            </m:r>
+          </m:sup>
+        </m:sSup>
+        <m:r>
+          <m:rPr>
+            <m:sty m:val="p"/>
+          </m:rPr>
+          <m:t>=</m:t>
+        </m:r>
+        <m:r>
+          <m:t>1</m:t>
+        </m:r>
+      </m:oMath>
+      <w:r>
+        <w:t xml:space="preserve"> </w:t>
+      </w:r>
+      <w:r>
+        <w:t xml:space="preserve">placement each, so subtract</w:t>
+      </w:r>
+      <w:r>
+        <w:t xml:space="preserve"> </w:t>
+      </w:r>
+      <m:oMath>
+        <m:r>
+          <m:t>2</m:t>
+        </m:r>
+      </m:oMath>
+      <w:r>
+        <w:t xml:space="preserve">; add back the ones missing two boxes, of which there are none. Total</w:t>
+      </w:r>
+      <w:r>
+        <w:t xml:space="preserve"> </w:t>
+      </w:r>
+      <m:oMath>
+        <m:r>
+          <m:t>4</m:t>
+        </m:r>
+        <m:r>
+          <m:rPr>
+            <m:sty m:val="p"/>
+          </m:rPr>
+          <m:t>−</m:t>
+        </m:r>
+        <m:r>
+          <m:t>2</m:t>
+        </m:r>
+        <m:r>
+          <m:rPr>
+            <m:sty m:val="p"/>
+          </m:rPr>
+          <m:t>+</m:t>
+        </m:r>
+        <m:r>
+          <m:t>0</m:t>
+        </m:r>
+        <m:r>
+          <m:rPr>
+            <m:sty m:val="p"/>
+          </m:rPr>
+          <m:t>=</m:t>
+        </m:r>
+        <m:r>
+          <m:t>2</m:t>
+        </m:r>
+      </m:oMath>
+      <w:r>
+        <w:t xml:space="preserve">. ✔</w:t>
+      </w:r>
+    </w:p>
+    <w:p>
+      <w:pPr>
+        <w:pStyle w:val="BodyText"/>
+      </w:pPr>
+      <w:r>
+        <w:t xml:space="preserve">And the formula gives</w:t>
+      </w:r>
+      <w:r>
+        <w:t xml:space="preserve"> </w:t>
+      </w:r>
+      <m:oMath>
+        <m:r>
+          <m:t> </m:t>
+        </m:r>
+        <m:r>
+          <m:t>0</m:t>
+        </m:r>
+        <m:r>
+          <m:rPr>
+            <m:sty m:val="p"/>
+          </m:rPr>
+          <m:t>−</m:t>
+        </m:r>
+        <m:r>
+          <m:t>2</m:t>
+        </m:r>
+        <m:d>
+          <m:dPr>
+            <m:begChr m:val="("/>
+            <m:endChr m:val=")"/>
+            <m:sepChr m:val=""/>
+            <m:grow/>
+          </m:dPr>
+          <m:e>
+            <m:r>
+              <m:t>1</m:t>
+            </m:r>
+          </m:e>
+        </m:d>
+        <m:r>
+          <m:rPr>
+            <m:sty m:val="p"/>
+          </m:rPr>
+          <m:t>+</m:t>
+        </m:r>
+        <m:r>
+          <m:t>1</m:t>
+        </m:r>
+        <m:d>
+          <m:dPr>
+            <m:begChr m:val="("/>
+            <m:endChr m:val=")"/>
+            <m:sepChr m:val=""/>
+            <m:grow/>
+          </m:dPr>
+          <m:e>
+            <m:r>
+              <m:t>4</m:t>
+            </m:r>
+          </m:e>
+        </m:d>
+        <m:r>
+          <m:rPr>
+            <m:sty m:val="p"/>
+          </m:rPr>
+          <m:t>=</m:t>
+        </m:r>
+        <m:r>
+          <m:t>2</m:t>
+        </m:r>
+        <m:r>
+          <m:t> </m:t>
+        </m:r>
+      </m:oMath>
+      <w:r>
+        <w:t xml:space="preserve"> </w:t>
+      </w:r>
+      <w:r>
+        <w:t xml:space="preserve">— the same</w:t>
+      </w:r>
+      <w:r>
+        <w:t xml:space="preserve"> </w:t>
+      </w:r>
+      <m:oMath>
+        <m:r>
+          <m:t>2</m:t>
+        </m:r>
+      </m:oMath>
+      <w:r>
+        <w:t xml:space="preserve">, which is</w:t>
+      </w:r>
+      <w:r>
+        <w:t xml:space="preserve"> </w:t>
+      </w:r>
+      <m:oMath>
+        <m:r>
+          <m:t>2</m:t>
+        </m:r>
+        <m:r>
+          <m:rPr>
+            <m:sty m:val="p"/>
+          </m:rPr>
+          <m:t>!</m:t>
+        </m:r>
+      </m:oMath>
+      <w:r>
+        <w:t xml:space="preserve">.</w:t>
+      </w:r>
+      <w:r>
+        <w:t xml:space="preserve"> </w:t>
+      </w:r>
+      <w:r>
+        <w:rPr>
+          <w:bCs/>
+          <w:b/>
+        </w:rPr>
+        <w:t xml:space="preserve">The listing, the inclusion–exclusion, and the formula all agree at</w:t>
+      </w:r>
+      <w:r>
+        <w:rPr>
+          <w:bCs/>
+          <w:b/>
+        </w:rPr>
+        <w:t xml:space="preserve"> </w:t>
+      </w:r>
+      <m:oMath>
+        <m:r>
+          <m:t>k</m:t>
+        </m:r>
+        <m:r>
+          <m:rPr>
+            <m:sty m:val="p"/>
+          </m:rPr>
+          <m:t>=</m:t>
+        </m:r>
+        <m:r>
+          <m:t>2</m:t>
+        </m:r>
+      </m:oMath>
+      <w:r>
+        <w:t xml:space="preserve">, which is enough to see the mechanism before trusting it in general.</w:t>
+      </w:r>
+    </w:p>
+    <w:p>
+      <w:pPr>
+        <w:pStyle w:val="BodyText"/>
+      </w:pPr>
+      <w:r>
+        <w:rPr>
+          <w:bCs/>
+          <w:b/>
+        </w:rPr>
         <w:t xml:space="preserve">Now count the same thing directly.</w:t>
       </w:r>
       <w:r>
@@ -13161,7 +14204,7 @@
         <w:t xml:space="preserve"> </w:t>
       </w:r>
       <w:r>
-        <w:t xml:space="preserve">independent pieces of information: the order</w:t>
+        <w:t xml:space="preserve">pieces of information: the order</w:t>
       </w:r>
       <w:r>
         <w:t xml:space="preserve"> </w:t>
@@ -13197,7 +14240,7 @@
         <w:t xml:space="preserve"> </w:t>
       </w:r>
       <w:r>
-        <w:t xml:space="preserve">while holding the Standard Power Base fixed. Here we vary the other things.</w:t>
+        <w:t xml:space="preserve">while holding the Standard Power Base fixed. Here we vary other things.</w:t>
       </w:r>
     </w:p>
     <w:p>
@@ -13209,7 +14252,231 @@
           <w:bCs/>
           <w:b/>
         </w:rPr>
-        <w:t xml:space="preserve">Changing them does not produce another instance of the Root Theorem. It produces a different Base String, and therefore a different String Tree.</w:t>
+        <w:t xml:space="preserve">Changing them does not produce another instance of the Root Theorem. It produces a different string, and therefore a different tree.</w:t>
+      </w:r>
+    </w:p>
+    <w:p>
+      <w:pPr>
+        <w:pStyle w:val="BlockText"/>
+      </w:pPr>
+      <w:r>
+        <w:rPr>
+          <w:bCs/>
+          <w:b/>
+        </w:rPr>
+        <w:t xml:space="preserve">⚠ A definitional caution, and it matters for reading the rest of this section.</w:t>
+      </w:r>
+      <w:r>
+        <w:t xml:space="preserve"> </w:t>
+      </w:r>
+      <w:r>
+        <w:t xml:space="preserve">A Base String is</w:t>
+      </w:r>
+      <w:r>
+        <w:t xml:space="preserve"> </w:t>
+      </w:r>
+      <w:r>
+        <w:rPr>
+          <w:iCs/>
+          <w:i/>
+        </w:rPr>
+        <w:t xml:space="preserve">exactly</w:t>
+      </w:r>
+      <w:r>
+        <w:t xml:space="preserve"> </w:t>
+      </w:r>
+      <m:oMath>
+        <m:sSub>
+          <m:e>
+            <m:r>
+              <m:t>B</m:t>
+            </m:r>
+          </m:e>
+          <m:sub>
+            <m:r>
+              <m:t>n</m:t>
+            </m:r>
+          </m:sub>
+        </m:sSub>
+        <m:r>
+          <m:rPr>
+            <m:sty m:val="p"/>
+          </m:rPr>
+          <m:t>=</m:t>
+        </m:r>
+        <m:sSup>
+          <m:e>
+            <m:d>
+              <m:dPr>
+                <m:begChr m:val="("/>
+                <m:endChr m:val=")"/>
+                <m:sepChr m:val=""/>
+                <m:grow/>
+              </m:dPr>
+              <m:e>
+                <m:sSub>
+                  <m:e>
+                    <m:r>
+                      <m:t>P</m:t>
+                    </m:r>
+                  </m:e>
+                  <m:sub>
+                    <m:r>
+                      <m:t>n</m:t>
+                    </m:r>
+                  </m:sub>
+                </m:sSub>
+              </m:e>
+            </m:d>
+          </m:e>
+          <m:sup>
+            <m:r>
+              <m:t>k</m:t>
+            </m:r>
+          </m:sup>
+        </m:sSup>
+      </m:oMath>
+      <w:r>
+        <w:t xml:space="preserve"> </w:t>
+      </w:r>
+      <w:r>
+        <w:t xml:space="preserve">— each Prime value raised to a power.</w:t>
+      </w:r>
+      <w:r>
+        <w:t xml:space="preserve"> </w:t>
+      </w:r>
+      <w:r>
+        <w:rPr>
+          <w:bCs/>
+          <w:b/>
+        </w:rPr>
+        <w:t xml:space="preserve">Question 3 below steps outside that definition</w:t>
+      </w:r>
+      <w:r>
+        <w:t xml:space="preserve">, considering a general polynomial such as</w:t>
+      </w:r>
+      <w:r>
+        <w:t xml:space="preserve"> </w:t>
+      </w:r>
+      <m:oMath>
+        <m:r>
+          <m:t>3</m:t>
+        </m:r>
+        <m:sSup>
+          <m:e>
+            <m:r>
+              <m:t>n</m:t>
+            </m:r>
+          </m:e>
+          <m:sup>
+            <m:r>
+              <m:t>2</m:t>
+            </m:r>
+          </m:sup>
+        </m:sSup>
+        <m:r>
+          <m:rPr>
+            <m:sty m:val="p"/>
+          </m:rPr>
+          <m:t>+</m:t>
+        </m:r>
+        <m:r>
+          <m:t>5</m:t>
+        </m:r>
+        <m:r>
+          <m:t>n</m:t>
+        </m:r>
+        <m:r>
+          <m:rPr>
+            <m:sty m:val="p"/>
+          </m:rPr>
+          <m:t>+</m:t>
+        </m:r>
+        <m:r>
+          <m:t>7</m:t>
+        </m:r>
+      </m:oMath>
+      <w:r>
+        <w:t xml:space="preserve">, which</w:t>
+      </w:r>
+      <w:r>
+        <w:t xml:space="preserve"> </w:t>
+      </w:r>
+      <w:r>
+        <w:rPr>
+          <w:bCs/>
+          <w:b/>
+        </w:rPr>
+        <w:t xml:space="preserve">cannot</w:t>
+      </w:r>
+      <w:r>
+        <w:t xml:space="preserve"> </w:t>
+      </w:r>
+      <w:r>
+        <w:t xml:space="preserve">be written as</w:t>
+      </w:r>
+      <w:r>
+        <w:t xml:space="preserve"> </w:t>
+      </w:r>
+      <m:oMath>
+        <m:sSup>
+          <m:e>
+            <m:d>
+              <m:dPr>
+                <m:begChr m:val="("/>
+                <m:endChr m:val=")"/>
+                <m:sepChr m:val=""/>
+                <m:grow/>
+              </m:dPr>
+              <m:e>
+                <m:sSub>
+                  <m:e>
+                    <m:r>
+                      <m:t>P</m:t>
+                    </m:r>
+                  </m:e>
+                  <m:sub>
+                    <m:r>
+                      <m:t>n</m:t>
+                    </m:r>
+                  </m:sub>
+                </m:sSub>
+              </m:e>
+            </m:d>
+          </m:e>
+          <m:sup>
+            <m:r>
+              <m:t>k</m:t>
+            </m:r>
+          </m:sup>
+        </m:sSup>
+      </m:oMath>
+      <w:r>
+        <w:t xml:space="preserve"> </w:t>
+      </w:r>
+      <w:r>
+        <w:t xml:space="preserve">for any Prime String and any order.</w:t>
+      </w:r>
+    </w:p>
+    <w:p>
+      <w:pPr>
+        <w:pStyle w:val="BlockText"/>
+      </w:pPr>
+      <w:r>
+        <w:t xml:space="preserve">That is deliberate, because the differencing machinery of §9 does not actually require a Base String — it works on</w:t>
+      </w:r>
+      <w:r>
+        <w:t xml:space="preserve"> </w:t>
+      </w:r>
+      <w:r>
+        <w:rPr>
+          <w:bCs/>
+          <w:b/>
+        </w:rPr>
+        <w:t xml:space="preserve">any polynomial sequence</w:t>
+      </w:r>
+      <w:r>
+        <w:t xml:space="preserve">. But such a sequence is not a Base String, and this document will not call it one.</w:t>
       </w:r>
     </w:p>
     <w:bookmarkStart w:id="75" w:name="three-separate-questions"/>
@@ -13662,7 +14929,17 @@
           <w:bCs/>
           <w:b/>
         </w:rPr>
-        <w:t xml:space="preserve">Question 3 — Does the leading coefficient matter?</w:t>
+        <w:t xml:space="preserve">Question 3 — Does a multiplier out front matter?</w:t>
+      </w:r>
+      <w:r>
+        <w:t xml:space="preserve"> </w:t>
+      </w:r>
+      <w:r>
+        <w:rPr>
+          <w:iCs/>
+          <w:i/>
+        </w:rPr>
+        <w:t xml:space="preserve">(This one leaves the Base String definition — see the caution above.)</w:t>
       </w:r>
     </w:p>
     <w:p>
@@ -13670,30 +14947,12 @@
         <w:pStyle w:val="BodyText"/>
       </w:pPr>
       <w:r>
-        <w:t xml:space="preserve">Take</w:t>
+        <w:t xml:space="preserve">Take the general polynomial</w:t>
       </w:r>
       <w:r>
         <w:t xml:space="preserve"> </w:t>
       </w:r>
       <m:oMath>
-        <m:sSub>
-          <m:e>
-            <m:r>
-              <m:t>B</m:t>
-            </m:r>
-          </m:e>
-          <m:sub>
-            <m:r>
-              <m:t>n</m:t>
-            </m:r>
-          </m:sub>
-        </m:sSub>
-        <m:r>
-          <m:rPr>
-            <m:sty m:val="p"/>
-          </m:rPr>
-          <m:t>=</m:t>
-        </m:r>
         <m:r>
           <m:t>3</m:t>
         </m:r>
@@ -13732,21 +14991,12 @@
         </m:r>
       </m:oMath>
       <w:r>
-        <w:t xml:space="preserve">, giving</w:t>
+        <w:t xml:space="preserve">, giving the string</w:t>
       </w:r>
       <w:r>
         <w:t xml:space="preserve"> </w:t>
       </w:r>
       <m:oMath>
-        <m:r>
-          <m:t>B</m:t>
-        </m:r>
-        <m:r>
-          <m:rPr>
-            <m:sty m:val="p"/>
-          </m:rPr>
-          <m:t>=</m:t>
-        </m:r>
         <m:d>
           <m:dPr>
             <m:begChr m:val="("/>
@@ -13809,7 +15059,7 @@
         <w:rPr>
           <w:rStyle w:val="VerbatimChar"/>
         </w:rPr>
-        <w:t xml:space="preserve">B     7   15   29   49   75</w:t>
+        <w:t xml:space="preserve">      7   15   29   49   75</w:t>
       </w:r>
       <w:r>
         <w:br/>
@@ -13818,7 +15068,7 @@
         <w:rPr>
           <w:rStyle w:val="VerbatimChar"/>
         </w:rPr>
-        <w:t xml:space="preserve">1S       8   14   20   26</w:t>
+        <w:t xml:space="preserve">        8   14   20   26</w:t>
       </w:r>
       <w:r>
         <w:br/>
@@ -13827,7 +15077,7 @@
         <w:rPr>
           <w:rStyle w:val="VerbatimChar"/>
         </w:rPr>
-        <w:t xml:space="preserve">2S          6    6    6       &lt;- ROOT = 6 = 3 x 2!</w:t>
+        <w:t xml:space="preserve">           6    6    6       &lt;- ROOT = 6 = 3 x 2!</w:t>
       </w:r>
     </w:p>
     <w:p>
@@ -13845,18 +15095,7 @@
         <w:t xml:space="preserve"> </w:t>
       </w:r>
       <w:r>
-        <w:t xml:space="preserve">The Root is multiplied by the leading coefficient</w:t>
-      </w:r>
-      <w:r>
-        <w:t xml:space="preserve"> </w:t>
-      </w:r>
-      <m:oMath>
-        <m:r>
-          <m:t>a</m:t>
-        </m:r>
-      </m:oMath>
-      <w:r>
-        <w:t xml:space="preserve">. Note also that the</w:t>
+        <w:t xml:space="preserve">The Root is multiplied by 3. Note also that the</w:t>
       </w:r>
       <w:r>
         <w:t xml:space="preserve"> </w:t>
@@ -13905,21 +15144,15 @@
         </w:rPr>
         <w:t xml:space="preserve">the Root cannot see them.</w:t>
       </w:r>
-      <w:r>
-        <w:t xml:space="preserve"> </w:t>
-      </w:r>
-      <w:r>
-        <w:t xml:space="preserve">Note too that this Base String is a general polynomial rather than a pure power, so again we are outside the Standard Power Base.</w:t>
-      </w:r>
     </w:p>
     <w:bookmarkEnd w:id="75"/>
-    <w:bookmarkStart w:id="77" w:name="the-combined-law"/>
+    <w:bookmarkStart w:id="77" w:name="the-three-answers-collapse-into-one"/>
     <w:p>
       <w:pPr>
         <w:pStyle w:val="Heading2"/>
       </w:pPr>
       <w:r>
-        <w:t xml:space="preserve">10.2 The combined law</w:t>
+        <w:t xml:space="preserve">10.2 The three answers collapse into one</w:t>
       </w:r>
     </w:p>
     <w:p>
@@ -13927,16 +15160,297 @@
         <w:pStyle w:val="FirstParagraph"/>
       </w:pPr>
       <w:r>
-        <w:t xml:space="preserve">Putting the three together:</w:t>
+        <w:t xml:space="preserve">It is tempting to record the three findings as three separate knobs — a step</w:t>
+      </w:r>
+      <w:r>
+        <w:t xml:space="preserve"> </w:t>
+      </w:r>
+      <m:oMath>
+        <m:r>
+          <m:t>d</m:t>
+        </m:r>
+      </m:oMath>
+      <w:r>
+        <w:t xml:space="preserve">, a multiplier</w:t>
+      </w:r>
+      <w:r>
+        <w:t xml:space="preserve"> </w:t>
+      </w:r>
+      <m:oMath>
+        <m:r>
+          <m:t>a</m:t>
+        </m:r>
+      </m:oMath>
+      <w:r>
+        <w:t xml:space="preserve">, an order</w:t>
+      </w:r>
+      <w:r>
+        <w:t xml:space="preserve"> </w:t>
+      </w:r>
+      <m:oMath>
+        <m:r>
+          <m:t>k</m:t>
+        </m:r>
+      </m:oMath>
+      <w:r>
+        <w:t xml:space="preserve"> </w:t>
+      </w:r>
+      <w:r>
+        <w:t xml:space="preserve">— and write</w:t>
+      </w:r>
+      <w:r>
+        <w:t xml:space="preserve"> </w:t>
+      </w:r>
+      <m:oMath>
+        <m:r>
+          <m:t>R</m:t>
+        </m:r>
+        <m:r>
+          <m:rPr>
+            <m:sty m:val="p"/>
+          </m:rPr>
+          <m:t>=</m:t>
+        </m:r>
+        <m:r>
+          <m:t>a</m:t>
+        </m:r>
+        <m:r>
+          <m:rPr>
+            <m:sty m:val="p"/>
+          </m:rPr>
+          <m:t>⋅</m:t>
+        </m:r>
+        <m:r>
+          <m:t>k</m:t>
+        </m:r>
+        <m:r>
+          <m:rPr>
+            <m:sty m:val="p"/>
+          </m:rPr>
+          <m:t>!</m:t>
+        </m:r>
+        <m:r>
+          <m:rPr>
+            <m:sty m:val="p"/>
+          </m:rPr>
+          <m:t>⋅</m:t>
+        </m:r>
+        <m:sSup>
+          <m:e>
+            <m:r>
+              <m:t>d</m:t>
+            </m:r>
+          </m:e>
+          <m:sup>
+            <m:r>
+              <m:t> </m:t>
+            </m:r>
+            <m:r>
+              <m:t>k</m:t>
+            </m:r>
+          </m:sup>
+        </m:sSup>
+      </m:oMath>
+      <w:r>
+        <w:t xml:space="preserve">.</w:t>
+      </w:r>
+    </w:p>
+    <w:p>
+      <w:pPr>
+        <w:pStyle w:val="BodyText"/>
+      </w:pPr>
+      <w:r>
+        <w:rPr>
+          <w:bCs/>
+          <w:b/>
+        </w:rPr>
+        <w:t xml:space="preserve">That formula is true, but it is over-parameterised, and seeing why is more instructive than the formula.</w:t>
+      </w:r>
+    </w:p>
+    <w:p>
+      <w:pPr>
+        <w:pStyle w:val="BodyText"/>
+      </w:pPr>
+      <w:r>
+        <w:t xml:space="preserve">Watch what happens when the scaling is moved from the Prime String into the power:</w:t>
+      </w:r>
+    </w:p>
+    <w:p>
+      <w:pPr>
+        <w:pStyle w:val="SourceCode"/>
+      </w:pPr>
+      <w:r>
+        <w:rPr>
+          <w:rStyle w:val="VerbatimChar"/>
+        </w:rPr>
+        <w:t xml:space="preserve">P = (0,1,2,3,4)  with base operation  x -&gt; (2x)^3   -&gt;  0, 8, 64, 216, 512</w:t>
+      </w:r>
+      <w:r>
+        <w:br/>
+      </w:r>
+      <w:r>
+        <w:rPr>
+          <w:rStyle w:val="VerbatimChar"/>
+        </w:rPr>
+        <w:t xml:space="preserve">P = (0,2,4,6,8)  with base operation  x -&gt; x^3      -&gt;  0, 8, 64, 216, 512</w:t>
+      </w:r>
+    </w:p>
+    <w:p>
+      <w:pPr>
+        <w:pStyle w:val="FirstParagraph"/>
+      </w:pPr>
+      <w:r>
+        <w:rPr>
+          <w:bCs/>
+          <w:b/>
+        </w:rPr>
+        <w:t xml:space="preserve">These are not analogous. They are the same string, term for term</w:t>
+      </w:r>
+      <w:r>
+        <w:t xml:space="preserve"> </w:t>
+      </w:r>
+      <w:r>
+        <w:t xml:space="preserve">— and therefore the same tree, the same Root, the same everything. Stepping the Prime String by</w:t>
+      </w:r>
+      <w:r>
+        <w:t xml:space="preserve"> </w:t>
+      </w:r>
+      <m:oMath>
+        <m:r>
+          <m:t>2</m:t>
+        </m:r>
+      </m:oMath>
+      <w:r>
+        <w:t xml:space="preserve"> </w:t>
+      </w:r>
+      <w:r>
+        <w:t xml:space="preserve">and scaling inside the cube are</w:t>
+      </w:r>
+      <w:r>
+        <w:t xml:space="preserve"> </w:t>
+      </w:r>
+      <w:r>
+        <w:rPr>
+          <w:bCs/>
+          <w:b/>
+        </w:rPr>
+        <w:t xml:space="preserve">not two knobs. They are one knob reached from two directions.</w:t>
+      </w:r>
+    </w:p>
+    <w:p>
+      <w:pPr>
+        <w:pStyle w:val="BodyText"/>
+      </w:pPr>
+      <w:r>
+        <w:t xml:space="preserve">What both are really doing is setting a single number: the</w:t>
+      </w:r>
+      <w:r>
+        <w:t xml:space="preserve"> </w:t>
+      </w:r>
+      <w:r>
+        <w:rPr>
+          <w:bCs/>
+          <w:b/>
+        </w:rPr>
+        <w:t xml:space="preserve">leading coefficient of the string, viewed as a polynomial in the index</w:t>
+      </w:r>
+      <w:r>
+        <w:rPr>
+          <w:bCs/>
+          <w:b/>
+        </w:rPr>
+        <w:t xml:space="preserve"> </w:t>
+      </w:r>
+      <m:oMath>
+        <m:r>
+          <m:t>n</m:t>
+        </m:r>
+      </m:oMath>
+      <w:r>
+        <w:t xml:space="preserve">. Stepping by</w:t>
+      </w:r>
+      <w:r>
+        <w:t xml:space="preserve"> </w:t>
+      </w:r>
+      <m:oMath>
+        <m:r>
+          <m:t>d</m:t>
+        </m:r>
+      </m:oMath>
+      <w:r>
+        <w:t xml:space="preserve"> </w:t>
+      </w:r>
+      <w:r>
+        <w:t xml:space="preserve">sets it to</w:t>
+      </w:r>
+      <w:r>
+        <w:t xml:space="preserve"> </w:t>
+      </w:r>
+      <m:oMath>
+        <m:sSup>
+          <m:e>
+            <m:r>
+              <m:t>d</m:t>
+            </m:r>
+          </m:e>
+          <m:sup>
+            <m:r>
+              <m:t>k</m:t>
+            </m:r>
+          </m:sup>
+        </m:sSup>
+      </m:oMath>
+      <w:r>
+        <w:t xml:space="preserve">. A multiplier out front sets it to</w:t>
+      </w:r>
+      <w:r>
+        <w:t xml:space="preserve"> </w:t>
+      </w:r>
+      <m:oMath>
+        <m:r>
+          <m:t>a</m:t>
+        </m:r>
+      </m:oMath>
+      <w:r>
+        <w:t xml:space="preserve">. Doing both sets it to</w:t>
+      </w:r>
+      <w:r>
+        <w:t xml:space="preserve"> </w:t>
+      </w:r>
+      <m:oMath>
+        <m:r>
+          <m:t>a</m:t>
+        </m:r>
+        <m:r>
+          <m:rPr>
+            <m:sty m:val="p"/>
+          </m:rPr>
+          <m:t>⋅</m:t>
+        </m:r>
+        <m:sSup>
+          <m:e>
+            <m:r>
+              <m:t>d</m:t>
+            </m:r>
+          </m:e>
+          <m:sup>
+            <m:r>
+              <m:t>k</m:t>
+            </m:r>
+          </m:sup>
+        </m:sSup>
+      </m:oMath>
+      <w:r>
+        <w:t xml:space="preserve">. In every case the Root responds only to that one number:</w:t>
       </w:r>
     </w:p>
     <w:p>
       <w:pPr>
         <w:pStyle w:val="Heading3"/>
       </w:pPr>
-      <w:bookmarkStart w:id="76" w:name="the-general-root-law"/>
-      <w:r>
-        <w:t xml:space="preserve">The General Root Law</w:t>
+      <w:bookmarkStart w:id="76" w:name="the-root-law"/>
+      <w:r>
+        <w:t xml:space="preserve">The Root Law</w:t>
       </w:r>
       <w:bookmarkEnd w:id="76"/>
     </w:p>
@@ -13945,7 +15459,7 @@
         <w:pStyle w:val="BlockText"/>
       </w:pPr>
       <w:r>
-        <w:t xml:space="preserve">For a Base String that is a polynomial of degree</w:t>
+        <w:t xml:space="preserve">For any string that is a polynomial of degree</w:t>
       </w:r>
       <w:r>
         <w:t xml:space="preserve"> </w:t>
@@ -13959,25 +15473,14 @@
         <w:t xml:space="preserve"> </w:t>
       </w:r>
       <w:r>
-        <w:t xml:space="preserve">with leading coefficient</w:t>
+        <w:t xml:space="preserve">in the index, with leading coefficient</w:t>
       </w:r>
       <w:r>
         <w:t xml:space="preserve"> </w:t>
       </w:r>
       <m:oMath>
         <m:r>
-          <m:t>a</m:t>
-        </m:r>
-      </m:oMath>
-      <w:r>
-        <w:t xml:space="preserve">, built on an arithmetic Prime String of step</w:t>
-      </w:r>
-      <w:r>
-        <w:t xml:space="preserve"> </w:t>
-      </w:r>
-      <m:oMath>
-        <m:r>
-          <m:t>d</m:t>
+          <m:t>A</m:t>
         </m:r>
       </m:oMath>
       <w:r>
@@ -14003,7 +15506,7 @@
             <m:t>=</m:t>
           </m:r>
           <m:r>
-            <m:t>a</m:t>
+            <m:t>A</m:t>
           </m:r>
           <m:r>
             <m:rPr>
@@ -14020,27 +15523,6 @@
             </m:rPr>
             <m:t>!</m:t>
           </m:r>
-          <m:r>
-            <m:rPr>
-              <m:sty m:val="p"/>
-            </m:rPr>
-            <m:t>⋅</m:t>
-          </m:r>
-          <m:sSup>
-            <m:e>
-              <m:r>
-                <m:t>d</m:t>
-              </m:r>
-            </m:e>
-            <m:sup>
-              <m:r>
-                <m:t> </m:t>
-              </m:r>
-              <m:r>
-                <m:t>k</m:t>
-              </m:r>
-            </m:sup>
-          </m:sSup>
         </m:oMath>
       </m:oMathPara>
     </w:p>
@@ -14053,20 +15535,586 @@
           <w:bCs/>
           <w:b/>
         </w:rPr>
-        <w:t xml:space="preserve">Verification of the combined case.</w:t>
-      </w:r>
-      <w:r>
-        <w:t xml:space="preserve"> </w:t>
-      </w:r>
-      <w:r>
-        <w:t xml:space="preserve">Take</w:t>
+        <w:t xml:space="preserve">Checked against every case in this module:</w:t>
+      </w:r>
+    </w:p>
+    <w:tbl>
+      <w:tblPr>
+        <w:tblStyle w:val="Table"/>
+        <w:tblW w:type="pct" w:w="5000"/>
+        <w:tblLook w:firstRow="1" w:lastRow="0" w:firstColumn="0" w:lastColumn="0" w:noHBand="0" w:noVBand="0" w:val="0020"/>
+        <w:jc w:val="start"/>
+      </w:tblPr>
+      <w:tblGrid>
+        <w:gridCol w:w="1980"/>
+        <w:gridCol w:w="1980"/>
+        <w:gridCol w:w="1980"/>
+        <w:gridCol w:w="1980"/>
+      </w:tblGrid>
+      <w:tr>
+        <w:trPr>
+          <w:tblHeader w:val="true"/>
+        </w:trPr>
+        <w:tc>
+          <w:tcPr/>
+          <w:p>
+            <w:pPr>
+              <w:pStyle w:val="Compact"/>
+              <w:jc w:val="left"/>
+            </w:pPr>
+            <w:r>
+              <w:t xml:space="preserve">String</w:t>
+            </w:r>
+          </w:p>
+        </w:tc>
+        <w:tc>
+          <w:tcPr/>
+          <w:p>
+            <w:pPr>
+              <w:pStyle w:val="Compact"/>
+              <w:jc w:val="left"/>
+            </w:pPr>
+            <w:r>
+              <w:t xml:space="preserve">Leading coefficient</w:t>
+            </w:r>
+            <w:r>
+              <w:t xml:space="preserve"> </w:t>
+            </w:r>
+            <m:oMath>
+              <m:r>
+                <m:t>A</m:t>
+              </m:r>
+            </m:oMath>
+          </w:p>
+        </w:tc>
+        <w:tc>
+          <w:tcPr/>
+          <w:p>
+            <w:pPr>
+              <w:pStyle w:val="Compact"/>
+              <w:jc w:val="left"/>
+            </w:pPr>
+            <w:r>
+              <w:t xml:space="preserve">Predicted</w:t>
+            </w:r>
+            <w:r>
+              <w:t xml:space="preserve"> </w:t>
+            </w:r>
+            <m:oMath>
+              <m:r>
+                <m:t>R</m:t>
+              </m:r>
+              <m:r>
+                <m:rPr>
+                  <m:sty m:val="p"/>
+                </m:rPr>
+                <m:t>=</m:t>
+              </m:r>
+              <m:r>
+                <m:t>A</m:t>
+              </m:r>
+              <m:r>
+                <m:rPr>
+                  <m:sty m:val="p"/>
+                </m:rPr>
+                <m:t>⋅</m:t>
+              </m:r>
+              <m:r>
+                <m:t>k</m:t>
+              </m:r>
+              <m:r>
+                <m:rPr>
+                  <m:sty m:val="p"/>
+                </m:rPr>
+                <m:t>!</m:t>
+              </m:r>
+            </m:oMath>
+          </w:p>
+        </w:tc>
+        <w:tc>
+          <w:tcPr/>
+          <w:p>
+            <w:pPr>
+              <w:pStyle w:val="Compact"/>
+              <w:jc w:val="left"/>
+            </w:pPr>
+            <w:r>
+              <w:t xml:space="preserve">Observed</w:t>
+            </w:r>
+          </w:p>
+        </w:tc>
+      </w:tr>
+      <w:tr>
+        <w:tc>
+          <w:tcPr/>
+          <w:p>
+            <w:pPr>
+              <w:pStyle w:val="Compact"/>
+              <w:jc w:val="left"/>
+            </w:pPr>
+            <m:oMath>
+              <m:sSup>
+                <m:e>
+                  <m:r>
+                    <m:t>n</m:t>
+                  </m:r>
+                </m:e>
+                <m:sup>
+                  <m:r>
+                    <m:t>3</m:t>
+                  </m:r>
+                </m:sup>
+              </m:sSup>
+            </m:oMath>
+          </w:p>
+        </w:tc>
+        <w:tc>
+          <w:tcPr/>
+          <w:p>
+            <w:pPr>
+              <w:pStyle w:val="Compact"/>
+              <w:jc w:val="left"/>
+            </w:pPr>
+            <w:r>
+              <w:t xml:space="preserve">1</w:t>
+            </w:r>
+          </w:p>
+        </w:tc>
+        <w:tc>
+          <w:tcPr/>
+          <w:p>
+            <w:pPr>
+              <w:pStyle w:val="Compact"/>
+              <w:jc w:val="left"/>
+            </w:pPr>
+            <m:oMath>
+              <m:r>
+                <m:t>1</m:t>
+              </m:r>
+              <m:r>
+                <m:rPr>
+                  <m:sty m:val="p"/>
+                </m:rPr>
+                <m:t>⋅</m:t>
+              </m:r>
+              <m:r>
+                <m:t>6</m:t>
+              </m:r>
+              <m:r>
+                <m:rPr>
+                  <m:sty m:val="p"/>
+                </m:rPr>
+                <m:t>=</m:t>
+              </m:r>
+              <m:r>
+                <m:t>6</m:t>
+              </m:r>
+            </m:oMath>
+          </w:p>
+        </w:tc>
+        <w:tc>
+          <w:tcPr/>
+          <w:p>
+            <w:pPr>
+              <w:pStyle w:val="Compact"/>
+              <w:jc w:val="left"/>
+            </w:pPr>
+            <w:r>
+              <w:t xml:space="preserve">6 ✔</w:t>
+            </w:r>
+          </w:p>
+        </w:tc>
+      </w:tr>
+      <w:tr>
+        <w:tc>
+          <w:tcPr/>
+          <w:p>
+            <w:pPr>
+              <w:pStyle w:val="Compact"/>
+              <w:jc w:val="left"/>
+            </w:pPr>
+            <m:oMath>
+              <m:sSup>
+                <m:e>
+                  <m:d>
+                    <m:dPr>
+                      <m:begChr m:val="("/>
+                      <m:endChr m:val=")"/>
+                      <m:sepChr m:val=""/>
+                      <m:grow/>
+                    </m:dPr>
+                    <m:e>
+                      <m:r>
+                        <m:t>2</m:t>
+                      </m:r>
+                      <m:r>
+                        <m:t>n</m:t>
+                      </m:r>
+                    </m:e>
+                  </m:d>
+                </m:e>
+                <m:sup>
+                  <m:r>
+                    <m:t>3</m:t>
+                  </m:r>
+                </m:sup>
+              </m:sSup>
+              <m:r>
+                <m:rPr>
+                  <m:sty m:val="p"/>
+                </m:rPr>
+                <m:t>=</m:t>
+              </m:r>
+              <m:r>
+                <m:t>8</m:t>
+              </m:r>
+              <m:sSup>
+                <m:e>
+                  <m:r>
+                    <m:t>n</m:t>
+                  </m:r>
+                </m:e>
+                <m:sup>
+                  <m:r>
+                    <m:t>3</m:t>
+                  </m:r>
+                </m:sup>
+              </m:sSup>
+            </m:oMath>
+          </w:p>
+        </w:tc>
+        <w:tc>
+          <w:tcPr/>
+          <w:p>
+            <w:pPr>
+              <w:pStyle w:val="Compact"/>
+              <w:jc w:val="left"/>
+            </w:pPr>
+            <w:r>
+              <w:t xml:space="preserve">8</w:t>
+            </w:r>
+          </w:p>
+        </w:tc>
+        <w:tc>
+          <w:tcPr/>
+          <w:p>
+            <w:pPr>
+              <w:pStyle w:val="Compact"/>
+              <w:jc w:val="left"/>
+            </w:pPr>
+            <m:oMath>
+              <m:r>
+                <m:t>8</m:t>
+              </m:r>
+              <m:r>
+                <m:rPr>
+                  <m:sty m:val="p"/>
+                </m:rPr>
+                <m:t>⋅</m:t>
+              </m:r>
+              <m:r>
+                <m:t>6</m:t>
+              </m:r>
+              <m:r>
+                <m:rPr>
+                  <m:sty m:val="p"/>
+                </m:rPr>
+                <m:t>=</m:t>
+              </m:r>
+              <m:r>
+                <m:t>48</m:t>
+              </m:r>
+            </m:oMath>
+          </w:p>
+        </w:tc>
+        <w:tc>
+          <w:tcPr/>
+          <w:p>
+            <w:pPr>
+              <w:pStyle w:val="Compact"/>
+              <w:jc w:val="left"/>
+            </w:pPr>
+            <w:r>
+              <w:t xml:space="preserve">48 ✔</w:t>
+            </w:r>
+          </w:p>
+        </w:tc>
+      </w:tr>
+      <w:tr>
+        <w:tc>
+          <w:tcPr/>
+          <w:p>
+            <w:pPr>
+              <w:pStyle w:val="Compact"/>
+              <w:jc w:val="left"/>
+            </w:pPr>
+            <m:oMath>
+              <m:r>
+                <m:t>3</m:t>
+              </m:r>
+              <m:sSup>
+                <m:e>
+                  <m:r>
+                    <m:t>n</m:t>
+                  </m:r>
+                </m:e>
+                <m:sup>
+                  <m:r>
+                    <m:t>2</m:t>
+                  </m:r>
+                </m:sup>
+              </m:sSup>
+              <m:r>
+                <m:rPr>
+                  <m:sty m:val="p"/>
+                </m:rPr>
+                <m:t>+</m:t>
+              </m:r>
+              <m:r>
+                <m:t>5</m:t>
+              </m:r>
+              <m:r>
+                <m:t>n</m:t>
+              </m:r>
+              <m:r>
+                <m:rPr>
+                  <m:sty m:val="p"/>
+                </m:rPr>
+                <m:t>+</m:t>
+              </m:r>
+              <m:r>
+                <m:t>7</m:t>
+              </m:r>
+            </m:oMath>
+          </w:p>
+        </w:tc>
+        <w:tc>
+          <w:tcPr/>
+          <w:p>
+            <w:pPr>
+              <w:pStyle w:val="Compact"/>
+              <w:jc w:val="left"/>
+            </w:pPr>
+            <w:r>
+              <w:t xml:space="preserve">3</w:t>
+            </w:r>
+          </w:p>
+        </w:tc>
+        <w:tc>
+          <w:tcPr/>
+          <w:p>
+            <w:pPr>
+              <w:pStyle w:val="Compact"/>
+              <w:jc w:val="left"/>
+            </w:pPr>
+            <m:oMath>
+              <m:r>
+                <m:t>3</m:t>
+              </m:r>
+              <m:r>
+                <m:rPr>
+                  <m:sty m:val="p"/>
+                </m:rPr>
+                <m:t>⋅</m:t>
+              </m:r>
+              <m:r>
+                <m:t>2</m:t>
+              </m:r>
+              <m:r>
+                <m:rPr>
+                  <m:sty m:val="p"/>
+                </m:rPr>
+                <m:t>=</m:t>
+              </m:r>
+              <m:r>
+                <m:t>6</m:t>
+              </m:r>
+            </m:oMath>
+          </w:p>
+        </w:tc>
+        <w:tc>
+          <w:tcPr/>
+          <w:p>
+            <w:pPr>
+              <w:pStyle w:val="Compact"/>
+              <w:jc w:val="left"/>
+            </w:pPr>
+            <w:r>
+              <w:t xml:space="preserve">6 ✔</w:t>
+            </w:r>
+          </w:p>
+        </w:tc>
+      </w:tr>
+      <w:tr>
+        <w:tc>
+          <w:tcPr/>
+          <w:p>
+            <w:pPr>
+              <w:pStyle w:val="Compact"/>
+              <w:jc w:val="left"/>
+            </w:pPr>
+            <m:oMath>
+              <m:r>
+                <m:t>3</m:t>
+              </m:r>
+              <m:sSup>
+                <m:e>
+                  <m:d>
+                    <m:dPr>
+                      <m:begChr m:val="("/>
+                      <m:endChr m:val=")"/>
+                      <m:sepChr m:val=""/>
+                      <m:grow/>
+                    </m:dPr>
+                    <m:e>
+                      <m:r>
+                        <m:t>2</m:t>
+                      </m:r>
+                      <m:r>
+                        <m:t>n</m:t>
+                      </m:r>
+                    </m:e>
+                  </m:d>
+                </m:e>
+                <m:sup>
+                  <m:r>
+                    <m:t>2</m:t>
+                  </m:r>
+                </m:sup>
+              </m:sSup>
+              <m:r>
+                <m:rPr>
+                  <m:sty m:val="p"/>
+                </m:rPr>
+                <m:t>=</m:t>
+              </m:r>
+              <m:r>
+                <m:t>12</m:t>
+              </m:r>
+              <m:sSup>
+                <m:e>
+                  <m:r>
+                    <m:t>n</m:t>
+                  </m:r>
+                </m:e>
+                <m:sup>
+                  <m:r>
+                    <m:t>2</m:t>
+                  </m:r>
+                </m:sup>
+              </m:sSup>
+            </m:oMath>
+          </w:p>
+        </w:tc>
+        <w:tc>
+          <w:tcPr/>
+          <w:p>
+            <w:pPr>
+              <w:pStyle w:val="Compact"/>
+              <w:jc w:val="left"/>
+            </w:pPr>
+            <w:r>
+              <w:t xml:space="preserve">12</w:t>
+            </w:r>
+          </w:p>
+        </w:tc>
+        <w:tc>
+          <w:tcPr/>
+          <w:p>
+            <w:pPr>
+              <w:pStyle w:val="Compact"/>
+              <w:jc w:val="left"/>
+            </w:pPr>
+            <m:oMath>
+              <m:r>
+                <m:t>12</m:t>
+              </m:r>
+              <m:r>
+                <m:rPr>
+                  <m:sty m:val="p"/>
+                </m:rPr>
+                <m:t>⋅</m:t>
+              </m:r>
+              <m:r>
+                <m:t>2</m:t>
+              </m:r>
+              <m:r>
+                <m:rPr>
+                  <m:sty m:val="p"/>
+                </m:rPr>
+                <m:t>=</m:t>
+              </m:r>
+              <m:r>
+                <m:t>24</m:t>
+              </m:r>
+            </m:oMath>
+          </w:p>
+        </w:tc>
+        <w:tc>
+          <w:tcPr/>
+          <w:p>
+            <w:pPr>
+              <w:pStyle w:val="Compact"/>
+              <w:jc w:val="left"/>
+            </w:pPr>
+            <w:r>
+              <w:t xml:space="preserve">24 ✔</w:t>
+            </w:r>
+          </w:p>
+        </w:tc>
+      </w:tr>
+    </w:tbl>
+    <w:p>
+      <w:pPr>
+        <w:pStyle w:val="BodyText"/>
+      </w:pPr>
+      <w:r>
+        <w:t xml:space="preserve">The last row is the combined case that previously needed three parameters.</w:t>
+      </w:r>
+      <w:r>
+        <w:t xml:space="preserve"> </w:t>
+      </w:r>
+      <w:r>
+        <w:rPr>
+          <w:bCs/>
+          <w:b/>
+        </w:rPr>
+        <w:t xml:space="preserve">One number explains all four.</w:t>
+      </w:r>
+    </w:p>
+    <w:bookmarkEnd w:id="77"/>
+    <w:bookmarkStart w:id="78" w:name="how-this-relates-to-the-root-theorem"/>
+    <w:p>
+      <w:pPr>
+        <w:pStyle w:val="Heading2"/>
+      </w:pPr>
+      <w:r>
+        <w:t xml:space="preserve">10.3 How this relates to the Root Theorem</w:t>
+      </w:r>
+    </w:p>
+    <w:p>
+      <w:pPr>
+        <w:pStyle w:val="FirstParagraph"/>
+      </w:pPr>
+      <w:r>
+        <w:rPr>
+          <w:bCs/>
+          <w:b/>
+        </w:rPr>
+        <w:t xml:space="preserve">The Root Law is an extension into neighbouring territory, not a caveat on §9.</w:t>
+      </w:r>
+      <w:r>
+        <w:t xml:space="preserve"> </w:t>
+      </w:r>
+      <w:r>
+        <w:t xml:space="preserve">Setting</w:t>
       </w:r>
       <w:r>
         <w:t xml:space="preserve"> </w:t>
       </w:r>
       <m:oMath>
         <m:r>
-          <m:t>a</m:t>
+          <m:t>A</m:t>
         </m:r>
         <m:r>
           <m:rPr>
@@ -14075,18 +16123,21 @@
           <m:t>=</m:t>
         </m:r>
         <m:r>
-          <m:t>3</m:t>
+          <m:t>1</m:t>
         </m:r>
       </m:oMath>
       <w:r>
-        <w:t xml:space="preserve">,</w:t>
+        <w:t xml:space="preserve"> </w:t>
+      </w:r>
+      <w:r>
+        <w:t xml:space="preserve">— a monic string, which is what the Standard Power Base always produces — recovers</w:t>
       </w:r>
       <w:r>
         <w:t xml:space="preserve"> </w:t>
       </w:r>
       <m:oMath>
         <m:r>
-          <m:t>k</m:t>
+          <m:t>R</m:t>
         </m:r>
         <m:r>
           <m:rPr>
@@ -14095,304 +16146,6 @@
           <m:t>=</m:t>
         </m:r>
         <m:r>
-          <m:t>2</m:t>
-        </m:r>
-      </m:oMath>
-      <w:r>
-        <w:t xml:space="preserve">,</w:t>
-      </w:r>
-      <w:r>
-        <w:t xml:space="preserve"> </w:t>
-      </w:r>
-      <m:oMath>
-        <m:r>
-          <m:t>d</m:t>
-        </m:r>
-        <m:r>
-          <m:rPr>
-            <m:sty m:val="p"/>
-          </m:rPr>
-          <m:t>=</m:t>
-        </m:r>
-        <m:r>
-          <m:t>2</m:t>
-        </m:r>
-      </m:oMath>
-      <w:r>
-        <w:t xml:space="preserve">: the Prime String is</w:t>
-      </w:r>
-      <w:r>
-        <w:t xml:space="preserve"> </w:t>
-      </w:r>
-      <m:oMath>
-        <m:d>
-          <m:dPr>
-            <m:begChr m:val="("/>
-            <m:endChr m:val=")"/>
-            <m:sepChr m:val=""/>
-            <m:grow/>
-          </m:dPr>
-          <m:e>
-            <m:r>
-              <m:t>0</m:t>
-            </m:r>
-            <m:r>
-              <m:rPr>
-                <m:sty m:val="p"/>
-              </m:rPr>
-              <m:t>,</m:t>
-            </m:r>
-            <m:r>
-              <m:t>2</m:t>
-            </m:r>
-            <m:r>
-              <m:rPr>
-                <m:sty m:val="p"/>
-              </m:rPr>
-              <m:t>,</m:t>
-            </m:r>
-            <m:r>
-              <m:t>4</m:t>
-            </m:r>
-            <m:r>
-              <m:rPr>
-                <m:sty m:val="p"/>
-              </m:rPr>
-              <m:t>,</m:t>
-            </m:r>
-            <m:r>
-              <m:t>6</m:t>
-            </m:r>
-            <m:r>
-              <m:rPr>
-                <m:sty m:val="p"/>
-              </m:rPr>
-              <m:t>,</m:t>
-            </m:r>
-            <m:r>
-              <m:t>8</m:t>
-            </m:r>
-          </m:e>
-        </m:d>
-      </m:oMath>
-      <w:r>
-        <w:t xml:space="preserve"> </w:t>
-      </w:r>
-      <w:r>
-        <w:t xml:space="preserve">and</w:t>
-      </w:r>
-      <w:r>
-        <w:t xml:space="preserve"> </w:t>
-      </w:r>
-      <m:oMath>
-        <m:r>
-          <m:t>B</m:t>
-        </m:r>
-        <m:r>
-          <m:rPr>
-            <m:sty m:val="p"/>
-          </m:rPr>
-          <m:t>=</m:t>
-        </m:r>
-        <m:r>
-          <m:t>3</m:t>
-        </m:r>
-        <m:sSup>
-          <m:e>
-            <m:r>
-              <m:t>P</m:t>
-            </m:r>
-          </m:e>
-          <m:sup>
-            <m:r>
-              <m:t>2</m:t>
-            </m:r>
-          </m:sup>
-        </m:sSup>
-        <m:r>
-          <m:rPr>
-            <m:sty m:val="p"/>
-          </m:rPr>
-          <m:t>=</m:t>
-        </m:r>
-        <m:d>
-          <m:dPr>
-            <m:begChr m:val="("/>
-            <m:endChr m:val=")"/>
-            <m:sepChr m:val=""/>
-            <m:grow/>
-          </m:dPr>
-          <m:e>
-            <m:r>
-              <m:t>0</m:t>
-            </m:r>
-            <m:r>
-              <m:rPr>
-                <m:sty m:val="p"/>
-              </m:rPr>
-              <m:t>,</m:t>
-            </m:r>
-            <m:r>
-              <m:t>12</m:t>
-            </m:r>
-            <m:r>
-              <m:rPr>
-                <m:sty m:val="p"/>
-              </m:rPr>
-              <m:t>,</m:t>
-            </m:r>
-            <m:r>
-              <m:t>48</m:t>
-            </m:r>
-            <m:r>
-              <m:rPr>
-                <m:sty m:val="p"/>
-              </m:rPr>
-              <m:t>,</m:t>
-            </m:r>
-            <m:r>
-              <m:t>108</m:t>
-            </m:r>
-            <m:r>
-              <m:rPr>
-                <m:sty m:val="p"/>
-              </m:rPr>
-              <m:t>,</m:t>
-            </m:r>
-            <m:r>
-              <m:t>192</m:t>
-            </m:r>
-          </m:e>
-        </m:d>
-      </m:oMath>
-      <w:r>
-        <w:t xml:space="preserve">:</w:t>
-      </w:r>
-    </w:p>
-    <w:p>
-      <w:pPr>
-        <w:pStyle w:val="SourceCode"/>
-      </w:pPr>
-      <w:r>
-        <w:rPr>
-          <w:rStyle w:val="VerbatimChar"/>
-        </w:rPr>
-        <w:t xml:space="preserve">B     0   12   48  108  192</w:t>
-      </w:r>
-      <w:r>
-        <w:br/>
-      </w:r>
-      <w:r>
-        <w:rPr>
-          <w:rStyle w:val="VerbatimChar"/>
-        </w:rPr>
-        <w:t xml:space="preserve">1S      12   36   60   84</w:t>
-      </w:r>
-      <w:r>
-        <w:br/>
-      </w:r>
-      <w:r>
-        <w:rPr>
-          <w:rStyle w:val="VerbatimChar"/>
-        </w:rPr>
-        <w:t xml:space="preserve">2S         24   24   24       &lt;- ROOT = 24 = 3 x 2! x 2^2 = 3 x 2 x 4</w:t>
-      </w:r>
-    </w:p>
-    <w:p>
-      <w:pPr>
-        <w:pStyle w:val="FirstParagraph"/>
-      </w:pPr>
-      <w:r>
-        <w:t xml:space="preserve">Confirmed exactly.</w:t>
-      </w:r>
-    </w:p>
-    <w:bookmarkEnd w:id="77"/>
-    <w:bookmarkStart w:id="78" w:name="how-this-relates-to-the-root-theorem"/>
-    <w:p>
-      <w:pPr>
-        <w:pStyle w:val="Heading2"/>
-      </w:pPr>
-      <w:r>
-        <w:t xml:space="preserve">10.3 How this relates to the Root Theorem</w:t>
-      </w:r>
-    </w:p>
-    <w:p>
-      <w:pPr>
-        <w:pStyle w:val="FirstParagraph"/>
-      </w:pPr>
-      <w:r>
-        <w:rPr>
-          <w:bCs/>
-          <w:b/>
-        </w:rPr>
-        <w:t xml:space="preserve">The General Root Law is an extension into neighbouring territory, not a caveat on §9.</w:t>
-      </w:r>
-      <w:r>
-        <w:t xml:space="preserve"> </w:t>
-      </w:r>
-      <w:r>
-        <w:t xml:space="preserve">Setting</w:t>
-      </w:r>
-      <w:r>
-        <w:t xml:space="preserve"> </w:t>
-      </w:r>
-      <m:oMath>
-        <m:r>
-          <m:t>a</m:t>
-        </m:r>
-        <m:r>
-          <m:rPr>
-            <m:sty m:val="p"/>
-          </m:rPr>
-          <m:t>=</m:t>
-        </m:r>
-        <m:r>
-          <m:t>1</m:t>
-        </m:r>
-      </m:oMath>
-      <w:r>
-        <w:t xml:space="preserve"> </w:t>
-      </w:r>
-      <w:r>
-        <w:t xml:space="preserve">and</w:t>
-      </w:r>
-      <w:r>
-        <w:t xml:space="preserve"> </w:t>
-      </w:r>
-      <m:oMath>
-        <m:r>
-          <m:t>d</m:t>
-        </m:r>
-        <m:r>
-          <m:rPr>
-            <m:sty m:val="p"/>
-          </m:rPr>
-          <m:t>=</m:t>
-        </m:r>
-        <m:r>
-          <m:t>1</m:t>
-        </m:r>
-      </m:oMath>
-      <w:r>
-        <w:t xml:space="preserve"> </w:t>
-      </w:r>
-      <w:r>
-        <w:t xml:space="preserve">— which is to say, returning to the Standard Power Base — recovers</w:t>
-      </w:r>
-      <w:r>
-        <w:t xml:space="preserve"> </w:t>
-      </w:r>
-      <m:oMath>
-        <m:r>
-          <m:t>R</m:t>
-        </m:r>
-        <m:r>
-          <m:rPr>
-            <m:sty m:val="p"/>
-          </m:rPr>
-          <m:t>=</m:t>
-        </m:r>
-        <m:r>
           <m:t>k</m:t>
         </m:r>
         <m:r>
@@ -14441,7 +16194,7 @@
           <w:bCs/>
           <w:b/>
         </w:rPr>
-        <w:t xml:space="preserve">The Root sees exactly three things and is blind to everything else.</w:t>
+        <w:t xml:space="preserve">The Root sees exactly two things and is blind to everything else.</w:t>
       </w:r>
     </w:p>
     <w:tbl>
@@ -14507,7 +16260,7 @@
               <w:t xml:space="preserve"> </w:t>
             </w:r>
             <w:r>
-              <w:t xml:space="preserve">(via the depth at which it appears)</w:t>
+              <w:t xml:space="preserve">— via the depth at which it appears</w:t>
             </w:r>
           </w:p>
         </w:tc>
@@ -14540,7 +16293,36 @@
             </w:r>
             <m:oMath>
               <m:r>
-                <m:t>a</m:t>
+                <m:t>A</m:t>
+              </m:r>
+            </m:oMath>
+            <w:r>
+              <w:t xml:space="preserve"> </w:t>
+            </w:r>
+            <w:r>
+              <w:t xml:space="preserve">— via</w:t>
+            </w:r>
+            <w:r>
+              <w:t xml:space="preserve"> </w:t>
+            </w:r>
+            <m:oMath>
+              <m:r>
+                <m:t>R</m:t>
+              </m:r>
+              <m:r>
+                <m:rPr>
+                  <m:sty m:val="p"/>
+                </m:rPr>
+                <m:t>/</m:t>
+              </m:r>
+              <m:r>
+                <m:t>k</m:t>
+              </m:r>
+              <m:r>
+                <m:rPr>
+                  <m:sty m:val="p"/>
+                </m:rPr>
+                <m:t>!</m:t>
               </m:r>
             </m:oMath>
           </w:p>
@@ -14564,35 +16346,65 @@
           <w:p>
             <w:pPr>
               <w:pStyle w:val="Compact"/>
-              <w:jc w:val="left"/>
-            </w:pPr>
-            <w:r>
-              <w:t xml:space="preserve">The step size</w:t>
+            </w:pPr>
+          </w:p>
+        </w:tc>
+        <w:tc>
+          <w:tcPr/>
+          <w:p>
+            <w:pPr>
+              <w:pStyle w:val="Compact"/>
+              <w:jc w:val="left"/>
+            </w:pPr>
+            <w:r>
+              <w:rPr>
+                <w:iCs/>
+                <w:i/>
+              </w:rPr>
+              <w:t xml:space="preserve">How</w:t>
             </w:r>
             <w:r>
               <w:t xml:space="preserve"> </w:t>
             </w:r>
             <m:oMath>
               <m:r>
-                <m:t>d</m:t>
+                <m:t>A</m:t>
               </m:r>
             </m:oMath>
-          </w:p>
-        </w:tc>
-        <w:tc>
-          <w:tcPr/>
-          <w:p>
-            <w:pPr>
-              <w:pStyle w:val="Compact"/>
-              <w:jc w:val="left"/>
-            </w:pPr>
-            <w:r>
-              <w:t xml:space="preserve">Everything about the sequence except its top-order behaviour</w:t>
+            <w:r>
+              <w:t xml:space="preserve"> </w:t>
+            </w:r>
+            <w:r>
+              <w:t xml:space="preserve">was arrived at: step, multiplier, or both</w:t>
             </w:r>
           </w:p>
         </w:tc>
       </w:tr>
     </w:tbl>
+    <w:p>
+      <w:pPr>
+        <w:pStyle w:val="BodyText"/>
+      </w:pPr>
+      <w:r>
+        <w:t xml:space="preserve">That last row is the point of §10.2.</w:t>
+      </w:r>
+      <w:r>
+        <w:t xml:space="preserve"> </w:t>
+      </w:r>
+      <w:r>
+        <w:rPr>
+          <w:bCs/>
+          <w:b/>
+        </w:rPr>
+        <w:t xml:space="preserve">The Root cannot tell you whether a leading coefficient of 8 came from cubing a step-2 string or from multiplying a cube by 8</w:t>
+      </w:r>
+      <w:r>
+        <w:t xml:space="preserve"> </w:t>
+      </w:r>
+      <w:r>
+        <w:t xml:space="preserve">— because there is no difference between those two strings to detect.</w:t>
+      </w:r>
+    </w:p>
     <w:p>
       <w:pPr>
         <w:pStyle w:val="BodyText"/>
@@ -14637,7 +16449,7 @@
         <w:pStyle w:val="FirstParagraph"/>
       </w:pPr>
       <w:r>
-        <w:t xml:space="preserve">The General Root Law turns the String Tree into a diagnostic instrument. Given a sequence of numbers with</w:t>
+        <w:t xml:space="preserve">The Root Law turns the String Tree into a diagnostic instrument. Given a sequence of numbers with</w:t>
       </w:r>
       <w:r>
         <w:t xml:space="preserve"> </w:t>
@@ -14777,21 +16589,28 @@
       </w:r>
       <m:oMath>
         <m:r>
-          <m:t>a</m:t>
+          <m:t>A</m:t>
         </m:r>
       </m:oMath>
       <w:r>
-        <w:t xml:space="preserve"> </w:t>
-      </w:r>
-      <w:r>
-        <w:t xml:space="preserve">(assuming step</w:t>
+        <w:rPr>
+          <w:bCs/>
+          <w:b/>
+        </w:rPr>
+        <w:t xml:space="preserve">.</w:t>
+      </w:r>
+      <w:r>
+        <w:t xml:space="preserve"> </w:t>
+      </w:r>
+      <w:r>
+        <w:t xml:space="preserve">No further assumption is required — this is</w:t>
       </w:r>
       <w:r>
         <w:t xml:space="preserve"> </w:t>
       </w:r>
       <m:oMath>
         <m:r>
-          <m:t>d</m:t>
+          <m:t>R</m:t>
         </m:r>
         <m:r>
           <m:rPr>
@@ -14800,11 +16619,29 @@
           <m:t>=</m:t>
         </m:r>
         <m:r>
-          <m:t>1</m:t>
+          <m:t>A</m:t>
+        </m:r>
+        <m:r>
+          <m:rPr>
+            <m:sty m:val="p"/>
+          </m:rPr>
+          <m:t>⋅</m:t>
+        </m:r>
+        <m:r>
+          <m:t>k</m:t>
+        </m:r>
+        <m:r>
+          <m:rPr>
+            <m:sty m:val="p"/>
+          </m:rPr>
+          <m:t>!</m:t>
         </m:r>
       </m:oMath>
       <w:r>
-        <w:t xml:space="preserve">).</w:t>
+        <w:t xml:space="preserve"> </w:t>
+      </w:r>
+      <w:r>
+        <w:t xml:space="preserve">read backwards.</w:t>
       </w:r>
     </w:p>
     <w:bookmarkEnd w:id="80"/>
@@ -15935,14 +17772,28 @@
         <w:pStyle w:val="FirstParagraph"/>
       </w:pPr>
       <w:r>
-        <w:t xml:space="preserve">From the General Root Law, with an arithmetic Prime String of step</w:t>
+        <w:t xml:space="preserve">From the Root Law, for any polynomial string of degree</w:t>
       </w:r>
       <w:r>
         <w:t xml:space="preserve"> </w:t>
       </w:r>
       <m:oMath>
         <m:r>
-          <m:t>d</m:t>
+          <m:t>k</m:t>
+        </m:r>
+      </m:oMath>
+      <w:r>
+        <w:t xml:space="preserve"> </w:t>
+      </w:r>
+      <w:r>
+        <w:t xml:space="preserve">with leading coefficient</w:t>
+      </w:r>
+      <w:r>
+        <w:t xml:space="preserve"> </w:t>
+      </w:r>
+      <m:oMath>
+        <m:r>
+          <m:t>A</m:t>
         </m:r>
       </m:oMath>
       <w:r>
@@ -15989,21 +17840,9 @@
               </m:r>
             </m:num>
             <m:den>
-              <m:sSup>
-                <m:e>
-                  <m:r>
-                    <m:t>d</m:t>
-                  </m:r>
-                </m:e>
-                <m:sup>
-                  <m:r>
-                    <m:t> </m:t>
-                  </m:r>
-                  <m:r>
-                    <m:t>k</m:t>
-                  </m:r>
-                </m:sup>
-              </m:sSup>
+              <m:r>
+                <m:t>A</m:t>
+              </m:r>
             </m:den>
           </m:f>
         </m:oMath>
@@ -16014,7 +17853,111 @@
         <w:pStyle w:val="FirstParagraph"/>
       </w:pPr>
       <w:r>
-        <w:t xml:space="preserve">The factorial here is what remains of the Root once the step has been divided out.</w:t>
+        <w:t xml:space="preserve">The factorial here is what remains of the Root once the leading coefficient has been divided out. In the special case of a step-</w:t>
+      </w:r>
+      <m:oMath>
+        <m:r>
+          <m:t>d</m:t>
+        </m:r>
+      </m:oMath>
+      <w:r>
+        <w:t xml:space="preserve"> </w:t>
+      </w:r>
+      <w:r>
+        <w:t xml:space="preserve">Prime String raised to the</w:t>
+      </w:r>
+      <w:r>
+        <w:t xml:space="preserve"> </w:t>
+      </w:r>
+      <m:oMath>
+        <m:r>
+          <m:t>k</m:t>
+        </m:r>
+      </m:oMath>
+      <w:r>
+        <w:t xml:space="preserve">-th power,</w:t>
+      </w:r>
+      <w:r>
+        <w:t xml:space="preserve"> </w:t>
+      </w:r>
+      <m:oMath>
+        <m:r>
+          <m:t>A</m:t>
+        </m:r>
+        <m:r>
+          <m:rPr>
+            <m:sty m:val="p"/>
+          </m:rPr>
+          <m:t>=</m:t>
+        </m:r>
+        <m:sSup>
+          <m:e>
+            <m:r>
+              <m:t>d</m:t>
+            </m:r>
+          </m:e>
+          <m:sup>
+            <m:r>
+              <m:t> </m:t>
+            </m:r>
+            <m:r>
+              <m:t>k</m:t>
+            </m:r>
+          </m:sup>
+        </m:sSup>
+      </m:oMath>
+      <w:r>
+        <w:t xml:space="preserve"> </w:t>
+      </w:r>
+      <w:r>
+        <w:t xml:space="preserve">and this reads</w:t>
+      </w:r>
+      <w:r>
+        <w:t xml:space="preserve"> </w:t>
+      </w:r>
+      <m:oMath>
+        <m:r>
+          <m:t>k</m:t>
+        </m:r>
+        <m:r>
+          <m:rPr>
+            <m:sty m:val="p"/>
+          </m:rPr>
+          <m:t>!</m:t>
+        </m:r>
+        <m:r>
+          <m:rPr>
+            <m:sty m:val="p"/>
+          </m:rPr>
+          <m:t>=</m:t>
+        </m:r>
+        <m:r>
+          <m:t>R</m:t>
+        </m:r>
+        <m:r>
+          <m:rPr>
+            <m:sty m:val="p"/>
+          </m:rPr>
+          <m:t>/</m:t>
+        </m:r>
+        <m:sSup>
+          <m:e>
+            <m:r>
+              <m:t>d</m:t>
+            </m:r>
+          </m:e>
+          <m:sup>
+            <m:r>
+              <m:t> </m:t>
+            </m:r>
+            <m:r>
+              <m:t>k</m:t>
+            </m:r>
+          </m:sup>
+        </m:sSup>
+      </m:oMath>
+      <w:r>
+        <w:t xml:space="preserve">.</w:t>
       </w:r>
     </w:p>
     <w:bookmarkEnd w:id="84"/>
@@ -17856,15 +19799,37 @@
         <w:t xml:space="preserve"> </w:t>
       </w:r>
       <w:r>
-        <w:t xml:space="preserve">Prediction from the General Root Law:</w:t>
+        <w:t xml:space="preserve">Squaring a step-3 Prime String gives</w:t>
       </w:r>
       <w:r>
         <w:t xml:space="preserve"> </w:t>
       </w:r>
       <m:oMath>
-        <m:r>
-          <m:t>R</m:t>
-        </m:r>
+        <m:sSup>
+          <m:e>
+            <m:d>
+              <m:dPr>
+                <m:begChr m:val="("/>
+                <m:endChr m:val=")"/>
+                <m:sepChr m:val=""/>
+                <m:grow/>
+              </m:dPr>
+              <m:e>
+                <m:r>
+                  <m:t>3</m:t>
+                </m:r>
+                <m:r>
+                  <m:t>n</m:t>
+                </m:r>
+              </m:e>
+            </m:d>
+          </m:e>
+          <m:sup>
+            <m:r>
+              <m:t>2</m:t>
+            </m:r>
+          </m:sup>
+        </m:sSup>
         <m:r>
           <m:rPr>
             <m:sty m:val="p"/>
@@ -17872,7 +19837,59 @@
           <m:t>=</m:t>
         </m:r>
         <m:r>
-          <m:t>a</m:t>
+          <m:t>9</m:t>
+        </m:r>
+        <m:sSup>
+          <m:e>
+            <m:r>
+              <m:t>n</m:t>
+            </m:r>
+          </m:e>
+          <m:sup>
+            <m:r>
+              <m:t>2</m:t>
+            </m:r>
+          </m:sup>
+        </m:sSup>
+      </m:oMath>
+      <w:r>
+        <w:t xml:space="preserve">, so the leading coefficient is</w:t>
+      </w:r>
+      <w:r>
+        <w:t xml:space="preserve"> </w:t>
+      </w:r>
+      <m:oMath>
+        <m:r>
+          <m:t>A</m:t>
+        </m:r>
+        <m:r>
+          <m:rPr>
+            <m:sty m:val="p"/>
+          </m:rPr>
+          <m:t>=</m:t>
+        </m:r>
+        <m:r>
+          <m:t>9</m:t>
+        </m:r>
+      </m:oMath>
+      <w:r>
+        <w:t xml:space="preserve">. Prediction from the Root Law:</w:t>
+      </w:r>
+      <w:r>
+        <w:t xml:space="preserve"> </w:t>
+      </w:r>
+      <m:oMath>
+        <m:r>
+          <m:t>R</m:t>
+        </m:r>
+        <m:r>
+          <m:rPr>
+            <m:sty m:val="p"/>
+          </m:rPr>
+          <m:t>=</m:t>
+        </m:r>
+        <m:r>
+          <m:t>A</m:t>
         </m:r>
         <m:r>
           <m:rPr>
@@ -17893,28 +19910,10 @@
           <m:rPr>
             <m:sty m:val="p"/>
           </m:rPr>
-          <m:t>⋅</m:t>
-        </m:r>
-        <m:sSup>
-          <m:e>
-            <m:r>
-              <m:t>d</m:t>
-            </m:r>
-          </m:e>
-          <m:sup>
-            <m:r>
-              <m:t>k</m:t>
-            </m:r>
-          </m:sup>
-        </m:sSup>
-        <m:r>
-          <m:rPr>
-            <m:sty m:val="p"/>
-          </m:rPr>
           <m:t>=</m:t>
         </m:r>
         <m:r>
-          <m:t>1</m:t>
+          <m:t>9</m:t>
         </m:r>
         <m:r>
           <m:rPr>
@@ -17931,24 +19930,6 @@
           </m:rPr>
           <m:t>!</m:t>
         </m:r>
-        <m:r>
-          <m:rPr>
-            <m:sty m:val="p"/>
-          </m:rPr>
-          <m:t>⋅</m:t>
-        </m:r>
-        <m:sSup>
-          <m:e>
-            <m:r>
-              <m:t>3</m:t>
-            </m:r>
-          </m:e>
-          <m:sup>
-            <m:r>
-              <m:t>2</m:t>
-            </m:r>
-          </m:sup>
-        </m:sSup>
         <m:r>
           <m:rPr>
             <m:sty m:val="p"/>
@@ -20594,7 +22575,7 @@
               <w:jc w:val="left"/>
             </w:pPr>
             <w:r>
-              <w:t xml:space="preserve">General Root Law</w:t>
+              <w:t xml:space="preserve">Root Law</w:t>
             </w:r>
           </w:p>
         </w:tc>
@@ -20616,7 +22597,7 @@
                 <m:t>=</m:t>
               </m:r>
               <m:r>
-                <m:t>a</m:t>
+                <m:t>A</m:t>
               </m:r>
               <m:r>
                 <m:rPr>
@@ -20633,28 +22614,24 @@
                 </m:rPr>
                 <m:t>!</m:t>
               </m:r>
-              <m:r>
-                <m:rPr>
-                  <m:sty m:val="p"/>
-                </m:rPr>
-                <m:t>⋅</m:t>
-              </m:r>
-              <m:sSup>
-                <m:e>
-                  <m:r>
-                    <m:t>d</m:t>
-                  </m:r>
-                </m:e>
-                <m:sup>
-                  <m:r>
-                    <m:t> </m:t>
-                  </m:r>
-                  <m:r>
-                    <m:t>k</m:t>
-                  </m:r>
-                </m:sup>
-              </m:sSup>
             </m:oMath>
+            <w:r>
+              <w:t xml:space="preserve">,</w:t>
+            </w:r>
+            <w:r>
+              <w:t xml:space="preserve"> </w:t>
+            </w:r>
+            <m:oMath>
+              <m:r>
+                <m:t>A</m:t>
+              </m:r>
+            </m:oMath>
+            <w:r>
+              <w:t xml:space="preserve"> </w:t>
+            </w:r>
+            <w:r>
+              <w:t xml:space="preserve">the leading coefficient</w:t>
+            </w:r>
           </w:p>
         </w:tc>
         <w:tc>
@@ -20676,6 +22653,64 @@
             </w:r>
             <w:r>
               <w:t xml:space="preserve">(§9.5 + §10)</w:t>
+            </w:r>
+          </w:p>
+        </w:tc>
+      </w:tr>
+      <w:tr>
+        <w:tc>
+          <w:tcPr/>
+          <w:p>
+            <w:pPr>
+              <w:pStyle w:val="Compact"/>
+              <w:jc w:val="left"/>
+            </w:pPr>
+            <w:r>
+              <w:t xml:space="preserve">Step and multiplier are one knob</w:t>
+            </w:r>
+          </w:p>
+        </w:tc>
+        <w:tc>
+          <w:tcPr/>
+          <w:p>
+            <w:pPr>
+              <w:pStyle w:val="Compact"/>
+              <w:jc w:val="left"/>
+            </w:pPr>
+            <w:r>
+              <w:t xml:space="preserve">Scaling inside the power and stepping the Prime String give the</w:t>
+            </w:r>
+            <w:r>
+              <w:t xml:space="preserve"> </w:t>
+            </w:r>
+            <w:r>
+              <w:rPr>
+                <w:iCs/>
+                <w:i/>
+              </w:rPr>
+              <w:t xml:space="preserve">same string</w:t>
+            </w:r>
+          </w:p>
+        </w:tc>
+        <w:tc>
+          <w:tcPr/>
+          <w:p>
+            <w:pPr>
+              <w:pStyle w:val="Compact"/>
+              <w:jc w:val="left"/>
+            </w:pPr>
+            <w:r>
+              <w:rPr>
+                <w:bCs/>
+                <w:b/>
+              </w:rPr>
+              <w:t xml:space="preserve">Theorem</w:t>
+            </w:r>
+            <w:r>
+              <w:t xml:space="preserve"> </w:t>
+            </w:r>
+            <w:r>
+              <w:t xml:space="preserve">(§10.2, verified term-by-term)</w:t>
             </w:r>
           </w:p>
         </w:tc>
@@ -21144,15 +23179,13 @@
           <w:bCs/>
           <w:b/>
         </w:rPr>
-        <w:t xml:space="preserve">Version 2.</w:t>
-      </w:r>
-    </w:p>
-    <w:p>
-      <w:pPr>
-        <w:pStyle w:val="BodyText"/>
-      </w:pPr>
-      <w:r>
-        <w:t xml:space="preserve">Changes from Version 1, all in response to a directive to verify the Root Theorem exhaustively before publication:</w:t>
+        <w:t xml:space="preserve">Version 3.</w:t>
+      </w:r>
+      <w:r>
+        <w:t xml:space="preserve"> </w:t>
+      </w:r>
+      <w:r>
+        <w:t xml:space="preserve">A second full runthrough, directed after Version 2 was published. Five defects found, all in Version 2, all introduced by this document rather than inherited from any source.</w:t>
       </w:r>
     </w:p>
     <w:p>
@@ -21168,20 +23201,20 @@
           <w:bCs/>
           <w:b/>
         </w:rPr>
-        <w:t xml:space="preserve">§9.2.1 added</w:t>
-      </w:r>
-      <w:r>
-        <w:t xml:space="preserve"> </w:t>
-      </w:r>
-      <w:r>
-        <w:t xml:space="preserve">— the</w:t>
+        <w:t xml:space="preserve">§10.2 — the law was over-parameterised.</w:t>
+      </w:r>
+      <w:r>
+        <w:t xml:space="preserve"> </w:t>
+      </w:r>
+      <w:r>
+        <w:t xml:space="preserve">Version 2 gave</w:t>
       </w:r>
       <w:r>
         <w:t xml:space="preserve"> </w:t>
       </w:r>
       <m:oMath>
         <m:r>
-          <m:t>k</m:t>
+          <m:t>R</m:t>
         </m:r>
         <m:r>
           <m:rPr>
@@ -21190,14 +23223,142 @@
           <m:t>=</m:t>
         </m:r>
         <m:r>
-          <m:t>0</m:t>
-        </m:r>
+          <m:t>a</m:t>
+        </m:r>
+        <m:r>
+          <m:rPr>
+            <m:sty m:val="p"/>
+          </m:rPr>
+          <m:t>⋅</m:t>
+        </m:r>
+        <m:r>
+          <m:t>k</m:t>
+        </m:r>
+        <m:r>
+          <m:rPr>
+            <m:sty m:val="p"/>
+          </m:rPr>
+          <m:t>!</m:t>
+        </m:r>
+        <m:r>
+          <m:rPr>
+            <m:sty m:val="p"/>
+          </m:rPr>
+          <m:t>⋅</m:t>
+        </m:r>
+        <m:sSup>
+          <m:e>
+            <m:r>
+              <m:t>d</m:t>
+            </m:r>
+          </m:e>
+          <m:sup>
+            <m:r>
+              <m:t> </m:t>
+            </m:r>
+            <m:r>
+              <m:t>k</m:t>
+            </m:r>
+          </m:sup>
+        </m:sSup>
       </m:oMath>
       <w:r>
-        <w:t xml:space="preserve"> </w:t>
-      </w:r>
-      <w:r>
-        <w:t xml:space="preserve">edge case, the value most likely to break a general claim. It does not break.</w:t>
+        <w:t xml:space="preserve">, presenting the step</w:t>
+      </w:r>
+      <w:r>
+        <w:t xml:space="preserve"> </w:t>
+      </w:r>
+      <m:oMath>
+        <m:r>
+          <m:t>d</m:t>
+        </m:r>
+      </m:oMath>
+      <w:r>
+        <w:t xml:space="preserve"> </w:t>
+      </w:r>
+      <w:r>
+        <w:t xml:space="preserve">and the multiplier</w:t>
+      </w:r>
+      <w:r>
+        <w:t xml:space="preserve"> </w:t>
+      </w:r>
+      <m:oMath>
+        <m:r>
+          <m:t>a</m:t>
+        </m:r>
+      </m:oMath>
+      <w:r>
+        <w:t xml:space="preserve"> </w:t>
+      </w:r>
+      <w:r>
+        <w:t xml:space="preserve">as independent knobs.</w:t>
+      </w:r>
+      <w:r>
+        <w:t xml:space="preserve"> </w:t>
+      </w:r>
+      <w:r>
+        <w:rPr>
+          <w:bCs/>
+          <w:b/>
+        </w:rPr>
+        <w:t xml:space="preserve">They are not.</w:t>
+      </w:r>
+      <w:r>
+        <w:t xml:space="preserve"> </w:t>
+      </w:r>
+      <w:r>
+        <w:t xml:space="preserve">Scaling inside the power and stepping the Prime String produce</w:t>
+      </w:r>
+      <w:r>
+        <w:t xml:space="preserve"> </w:t>
+      </w:r>
+      <w:r>
+        <w:rPr>
+          <w:iCs/>
+          <w:i/>
+        </w:rPr>
+        <w:t xml:space="preserve">the same string, term for term</w:t>
+      </w:r>
+      <w:r>
+        <w:t xml:space="preserve"> </w:t>
+      </w:r>
+      <w:r>
+        <w:t xml:space="preserve">— verified directly. Both merely set the leading coefficient. The law is now</w:t>
+      </w:r>
+      <w:r>
+        <w:t xml:space="preserve"> </w:t>
+      </w:r>
+      <m:oMath>
+        <m:r>
+          <m:t>R</m:t>
+        </m:r>
+        <m:r>
+          <m:rPr>
+            <m:sty m:val="p"/>
+          </m:rPr>
+          <m:t>=</m:t>
+        </m:r>
+        <m:r>
+          <m:t>A</m:t>
+        </m:r>
+        <m:r>
+          <m:rPr>
+            <m:sty m:val="p"/>
+          </m:rPr>
+          <m:t>⋅</m:t>
+        </m:r>
+        <m:r>
+          <m:t>k</m:t>
+        </m:r>
+        <m:r>
+          <m:rPr>
+            <m:sty m:val="p"/>
+          </m:rPr>
+          <m:t>!</m:t>
+        </m:r>
+      </m:oMath>
+      <w:r>
+        <w:t xml:space="preserve">, with the three-parameter form shown as a decomposition rather than the statement.</w:t>
       </w:r>
     </w:p>
     <w:p>
@@ -21213,95 +23374,130 @@
           <w:bCs/>
           <w:b/>
         </w:rPr>
-        <w:t xml:space="preserve">§9.3 added</w:t>
-      </w:r>
-      <w:r>
-        <w:t xml:space="preserve"> </w:t>
-      </w:r>
-      <w:r>
-        <w:t xml:space="preserve">— verification at</w:t>
+        <w:t xml:space="preserve">§10 — a definitional error.</w:t>
+      </w:r>
+      <w:r>
+        <w:t xml:space="preserve"> </w:t>
+      </w:r>
+      <w:r>
+        <w:t xml:space="preserve">Version 2 called</w:t>
       </w:r>
       <w:r>
         <w:t xml:space="preserve"> </w:t>
       </w:r>
       <m:oMath>
         <m:r>
-          <m:t>k</m:t>
-        </m:r>
+          <m:t>3</m:t>
+        </m:r>
+        <m:sSup>
+          <m:e>
+            <m:r>
+              <m:t>n</m:t>
+            </m:r>
+          </m:e>
+          <m:sup>
+            <m:r>
+              <m:t>2</m:t>
+            </m:r>
+          </m:sup>
+        </m:sSup>
         <m:r>
           <m:rPr>
             <m:sty m:val="p"/>
           </m:rPr>
-          <m:t>=</m:t>
-        </m:r>
-        <m:r>
-          <m:t>7</m:t>
+          <m:t>+</m:t>
+        </m:r>
+        <m:r>
+          <m:t>5</m:t>
+        </m:r>
+        <m:r>
+          <m:t>n</m:t>
         </m:r>
         <m:r>
           <m:rPr>
             <m:sty m:val="p"/>
           </m:rPr>
-          <m:t>,</m:t>
-        </m:r>
-        <m:r>
-          <m:t>8</m:t>
-        </m:r>
-        <m:r>
-          <m:rPr>
-            <m:sty m:val="p"/>
-          </m:rPr>
-          <m:t>,</m:t>
-        </m:r>
-        <m:r>
-          <m:t>9</m:t>
-        </m:r>
-        <m:r>
-          <m:rPr>
-            <m:sty m:val="p"/>
-          </m:rPr>
-          <m:t>,</m:t>
-        </m:r>
-        <m:r>
-          <m:t>10</m:t>
+          <m:t>+</m:t>
+        </m:r>
+        <m:r>
+          <m:t>7</m:t>
         </m:r>
       </m:oMath>
       <w:r>
         <w:t xml:space="preserve"> </w:t>
       </w:r>
       <w:r>
-        <w:t xml:space="preserve">by an independent computational method, chosen specifically because building four more tables would have repeated the same method rather than tested it. Evidence now spans</w:t>
+        <w:t xml:space="preserve">a</w:t>
+      </w:r>
+      <w:r>
+        <w:t xml:space="preserve"> </w:t>
+      </w:r>
+      <w:r>
+        <w:t xml:space="preserve">“</w:t>
+      </w:r>
+      <w:r>
+        <w:t xml:space="preserve">Base String</w:t>
+      </w:r>
+      <w:r>
+        <w:t xml:space="preserve">”</w:t>
+      </w:r>
+      <w:r>
+        <w:t xml:space="preserve">.</w:t>
+      </w:r>
+      <w:r>
+        <w:t xml:space="preserve"> </w:t>
+      </w:r>
+      <w:r>
+        <w:rPr>
+          <w:bCs/>
+          <w:b/>
+        </w:rPr>
+        <w:t xml:space="preserve">It is not one:</w:t>
+      </w:r>
+      <w:r>
+        <w:t xml:space="preserve"> </w:t>
+      </w:r>
+      <w:r>
+        <w:t xml:space="preserve">a Base String is exactly</w:t>
       </w:r>
       <w:r>
         <w:t xml:space="preserve"> </w:t>
       </w:r>
       <m:oMath>
-        <m:r>
-          <m:t>k</m:t>
-        </m:r>
-        <m:r>
-          <m:rPr>
-            <m:sty m:val="p"/>
-          </m:rPr>
-          <m:t>=</m:t>
-        </m:r>
-        <m:r>
-          <m:t>0</m:t>
-        </m:r>
-        <m:r>
-          <m:rPr>
-            <m:sty m:val="p"/>
-          </m:rPr>
-          <m:t>…</m:t>
-        </m:r>
-        <m:r>
-          <m:t>10</m:t>
-        </m:r>
+        <m:sSup>
+          <m:e>
+            <m:d>
+              <m:dPr>
+                <m:begChr m:val="("/>
+                <m:endChr m:val=")"/>
+                <m:sepChr m:val=""/>
+                <m:grow/>
+              </m:dPr>
+              <m:e>
+                <m:sSub>
+                  <m:e>
+                    <m:r>
+                      <m:t>P</m:t>
+                    </m:r>
+                  </m:e>
+                  <m:sub>
+                    <m:r>
+                      <m:t>n</m:t>
+                    </m:r>
+                  </m:sub>
+                </m:sSub>
+              </m:e>
+            </m:d>
+          </m:e>
+          <m:sup>
+            <m:r>
+              <m:t>k</m:t>
+            </m:r>
+          </m:sup>
+        </m:sSup>
       </m:oMath>
       <w:r>
-        <w:t xml:space="preserve"> </w:t>
-      </w:r>
-      <w:r>
-        <w:t xml:space="preserve">by two routes.</w:t>
+        <w:t xml:space="preserve">, and no Prime String and order produce that polynomial. The differencing machinery works on any polynomial sequence, but such a sequence is not a Base String and this document no longer calls it one. A caution now appears before the section that needs it.</w:t>
       </w:r>
     </w:p>
     <w:p>
@@ -21317,13 +23513,33 @@
           <w:bCs/>
           <w:b/>
         </w:rPr>
-        <w:t xml:space="preserve">§9.6 added</w:t>
-      </w:r>
-      <w:r>
-        <w:t xml:space="preserve"> </w:t>
-      </w:r>
-      <w:r>
-        <w:t xml:space="preserve">— a second proof, by counting surjections, logically independent of the degree-descent proof.</w:t>
+        <w:t xml:space="preserve">§9.6 — the inclusion–exclusion step was asserted rather than shown</w:t>
+      </w:r>
+      <w:r>
+        <w:t xml:space="preserve">, which made it the one unverifiable link in an otherwise checkable proof. A complete worked case at</w:t>
+      </w:r>
+      <w:r>
+        <w:t xml:space="preserve"> </w:t>
+      </w:r>
+      <m:oMath>
+        <m:r>
+          <m:t>k</m:t>
+        </m:r>
+        <m:r>
+          <m:rPr>
+            <m:sty m:val="p"/>
+          </m:rPr>
+          <m:t>=</m:t>
+        </m:r>
+        <m:r>
+          <m:t>2</m:t>
+        </m:r>
+      </m:oMath>
+      <w:r>
+        <w:t xml:space="preserve"> </w:t>
+      </w:r>
+      <w:r>
+        <w:t xml:space="preserve">is now given: all four placements listed, the inclusion–exclusion performed, and the formula evaluated, all three agreeing.</w:t>
       </w:r>
     </w:p>
     <w:p>
@@ -21339,13 +23555,119 @@
           <w:bCs/>
           <w:b/>
         </w:rPr>
-        <w:t xml:space="preserve">§9.7 added</w:t>
-      </w:r>
-      <w:r>
-        <w:t xml:space="preserve"> </w:t>
-      </w:r>
-      <w:r>
-        <w:t xml:space="preserve">— on what independence of verification actually requires. Records honestly that four candidate proofs were assembled and only two proved independent, the other three being one argument in three notations.</w:t>
+        <w:t xml:space="preserve">§2.1, §2.2 — the order</w:t>
+      </w:r>
+      <w:r>
+        <w:rPr>
+          <w:bCs/>
+          <w:b/>
+        </w:rPr>
+        <w:t xml:space="preserve"> </w:t>
+      </w:r>
+      <m:oMath>
+        <m:r>
+          <m:t>k</m:t>
+        </m:r>
+      </m:oMath>
+      <w:r>
+        <w:rPr>
+          <w:bCs/>
+          <w:b/>
+        </w:rPr>
+        <w:t xml:space="preserve"> </w:t>
+      </w:r>
+      <w:r>
+        <w:rPr>
+          <w:bCs/>
+          <w:b/>
+        </w:rPr>
+        <w:t xml:space="preserve">was described loosely</w:t>
+      </w:r>
+      <w:r>
+        <w:t xml:space="preserve"> </w:t>
+      </w:r>
+      <w:r>
+        <w:t xml:space="preserve">as</w:t>
+      </w:r>
+      <w:r>
+        <w:t xml:space="preserve"> </w:t>
+      </w:r>
+      <w:r>
+        <w:t xml:space="preserve">“</w:t>
+      </w:r>
+      <w:r>
+        <w:t xml:space="preserve">an operation of order</w:t>
+      </w:r>
+      <w:r>
+        <w:t xml:space="preserve"> </w:t>
+      </w:r>
+      <m:oMath>
+        <m:r>
+          <m:t>k</m:t>
+        </m:r>
+      </m:oMath>
+      <w:r>
+        <w:t xml:space="preserve">”</w:t>
+      </w:r>
+      <w:r>
+        <w:t xml:space="preserve">. It is a power:</w:t>
+      </w:r>
+      <w:r>
+        <w:t xml:space="preserve"> </w:t>
+      </w:r>
+      <m:oMath>
+        <m:sSub>
+          <m:e>
+            <m:r>
+              <m:t>B</m:t>
+            </m:r>
+          </m:e>
+          <m:sub>
+            <m:r>
+              <m:t>n</m:t>
+            </m:r>
+          </m:sub>
+        </m:sSub>
+        <m:r>
+          <m:rPr>
+            <m:sty m:val="p"/>
+          </m:rPr>
+          <m:t>=</m:t>
+        </m:r>
+        <m:sSup>
+          <m:e>
+            <m:d>
+              <m:dPr>
+                <m:begChr m:val="("/>
+                <m:endChr m:val=")"/>
+                <m:sepChr m:val=""/>
+                <m:grow/>
+              </m:dPr>
+              <m:e>
+                <m:sSub>
+                  <m:e>
+                    <m:r>
+                      <m:t>P</m:t>
+                    </m:r>
+                  </m:e>
+                  <m:sub>
+                    <m:r>
+                      <m:t>n</m:t>
+                    </m:r>
+                  </m:sub>
+                </m:sSub>
+              </m:e>
+            </m:d>
+          </m:e>
+          <m:sup>
+            <m:r>
+              <m:t>k</m:t>
+            </m:r>
+          </m:sup>
+        </m:sSup>
+      </m:oMath>
+      <w:r>
+        <w:t xml:space="preserve">. The vaguer phrasing is what previously invited the misreading that a general function slot sits behind the notation.</w:t>
       </w:r>
     </w:p>
     <w:p>
@@ -21361,29 +23683,20 @@
           <w:bCs/>
           <w:b/>
         </w:rPr>
-        <w:t xml:space="preserve">§10 reframed.</w:t>
-      </w:r>
-      <w:r>
-        <w:t xml:space="preserve"> </w:t>
-      </w:r>
-      <w:r>
-        <w:t xml:space="preserve">Version 1 presented the Root Theorem as</w:t>
-      </w:r>
-      <w:r>
-        <w:t xml:space="preserve"> </w:t>
-      </w:r>
-      <w:r>
-        <w:t xml:space="preserve">“</w:t>
-      </w:r>
-      <w:r>
-        <w:t xml:space="preserve">the special case</w:t>
+        <w:t xml:space="preserve">§2.2 — index versus position was never pinned down.</w:t>
+      </w:r>
+      <w:r>
+        <w:t xml:space="preserve"> </w:t>
+      </w:r>
+      <w:r>
+        <w:t xml:space="preserve">Since indexing begins at</w:t>
       </w:r>
       <w:r>
         <w:t xml:space="preserve"> </w:t>
       </w:r>
       <m:oMath>
         <m:r>
-          <m:t>a</m:t>
+          <m:t>n</m:t>
         </m:r>
         <m:r>
           <m:rPr>
@@ -21392,7 +23705,193 @@
           <m:t>=</m:t>
         </m:r>
         <m:r>
-          <m:t>1</m:t>
+          <m:t>0</m:t>
+        </m:r>
+      </m:oMath>
+      <w:r>
+        <w:t xml:space="preserve">,</w:t>
+      </w:r>
+      <w:r>
+        <w:t xml:space="preserve"> </w:t>
+      </w:r>
+      <w:r>
+        <w:t xml:space="preserve">“</w:t>
+      </w:r>
+      <w:r>
+        <w:t xml:space="preserve">the 4th term</w:t>
+      </w:r>
+      <w:r>
+        <w:t xml:space="preserve">”</w:t>
+      </w:r>
+      <w:r>
+        <w:t xml:space="preserve"> </w:t>
+      </w:r>
+      <w:r>
+        <w:t xml:space="preserve">is ambiguous. The syllabus now says</w:t>
+      </w:r>
+      <w:r>
+        <w:t xml:space="preserve"> </w:t>
+      </w:r>
+      <w:r>
+        <w:rPr>
+          <w:bCs/>
+          <w:b/>
+        </w:rPr>
+        <w:t xml:space="preserve">index</w:t>
+      </w:r>
+      <w:r>
+        <w:t xml:space="preserve"> </w:t>
+      </w:r>
+      <w:r>
+        <w:t xml:space="preserve">throughout, with</w:t>
+      </w:r>
+      <w:r>
+        <w:t xml:space="preserve"> </w:t>
+      </w:r>
+      <m:oMath>
+        <m:sSup>
+          <m:e>
+            <m:r>
+              <m:t>B</m:t>
+            </m:r>
+          </m:e>
+          <m:sup>
+            <m:r>
+              <m:t>2</m:t>
+            </m:r>
+          </m:sup>
+        </m:sSup>
+        <m:d>
+          <m:dPr>
+            <m:begChr m:val="("/>
+            <m:endChr m:val=")"/>
+            <m:sepChr m:val=""/>
+            <m:grow/>
+          </m:dPr>
+          <m:e>
+            <m:r>
+              <m:t>4</m:t>
+            </m:r>
+          </m:e>
+        </m:d>
+        <m:r>
+          <m:rPr>
+            <m:sty m:val="p"/>
+          </m:rPr>
+          <m:t>=</m:t>
+        </m:r>
+        <m:r>
+          <m:t>16</m:t>
+        </m:r>
+      </m:oMath>
+      <w:r>
+        <w:t xml:space="preserve"> </w:t>
+      </w:r>
+      <w:r>
+        <w:t xml:space="preserve">given as the worked reading.</w:t>
+      </w:r>
+    </w:p>
+    <w:p>
+      <w:pPr>
+        <w:pStyle w:val="FirstParagraph"/>
+      </w:pPr>
+      <w:r>
+        <w:rPr>
+          <w:bCs/>
+          <w:b/>
+        </w:rPr>
+        <w:t xml:space="preserve">Version 2.</w:t>
+      </w:r>
+    </w:p>
+    <w:p>
+      <w:pPr>
+        <w:pStyle w:val="BodyText"/>
+      </w:pPr>
+      <w:r>
+        <w:t xml:space="preserve">Changes from Version 1, all in response to a directive to verify the Root Theorem exhaustively before publication:</w:t>
+      </w:r>
+    </w:p>
+    <w:p>
+      <w:pPr>
+        <w:numPr>
+          <w:ilvl w:val="0"/>
+          <w:numId w:val="1008"/>
+        </w:numPr>
+        <w:pStyle w:val="Compact"/>
+      </w:pPr>
+      <w:r>
+        <w:rPr>
+          <w:bCs/>
+          <w:b/>
+        </w:rPr>
+        <w:t xml:space="preserve">§9.2.1 added</w:t>
+      </w:r>
+      <w:r>
+        <w:t xml:space="preserve"> </w:t>
+      </w:r>
+      <w:r>
+        <w:t xml:space="preserve">— the</w:t>
+      </w:r>
+      <w:r>
+        <w:t xml:space="preserve"> </w:t>
+      </w:r>
+      <m:oMath>
+        <m:r>
+          <m:t>k</m:t>
+        </m:r>
+        <m:r>
+          <m:rPr>
+            <m:sty m:val="p"/>
+          </m:rPr>
+          <m:t>=</m:t>
+        </m:r>
+        <m:r>
+          <m:t>0</m:t>
+        </m:r>
+      </m:oMath>
+      <w:r>
+        <w:t xml:space="preserve"> </w:t>
+      </w:r>
+      <w:r>
+        <w:t xml:space="preserve">edge case, the value most likely to break a general claim. It does not break.</w:t>
+      </w:r>
+    </w:p>
+    <w:p>
+      <w:pPr>
+        <w:numPr>
+          <w:ilvl w:val="0"/>
+          <w:numId w:val="1008"/>
+        </w:numPr>
+        <w:pStyle w:val="Compact"/>
+      </w:pPr>
+      <w:r>
+        <w:rPr>
+          <w:bCs/>
+          <w:b/>
+        </w:rPr>
+        <w:t xml:space="preserve">§9.3 added</w:t>
+      </w:r>
+      <w:r>
+        <w:t xml:space="preserve"> </w:t>
+      </w:r>
+      <w:r>
+        <w:t xml:space="preserve">— verification at</w:t>
+      </w:r>
+      <w:r>
+        <w:t xml:space="preserve"> </w:t>
+      </w:r>
+      <m:oMath>
+        <m:r>
+          <m:t>k</m:t>
+        </m:r>
+        <m:r>
+          <m:rPr>
+            <m:sty m:val="p"/>
+          </m:rPr>
+          <m:t>=</m:t>
+        </m:r>
+        <m:r>
+          <m:t>7</m:t>
         </m:r>
         <m:r>
           <m:rPr>
@@ -21401,7 +23900,39 @@
           <m:t>,</m:t>
         </m:r>
         <m:r>
-          <m:t>d</m:t>
+          <m:t>8</m:t>
+        </m:r>
+        <m:r>
+          <m:rPr>
+            <m:sty m:val="p"/>
+          </m:rPr>
+          <m:t>,</m:t>
+        </m:r>
+        <m:r>
+          <m:t>9</m:t>
+        </m:r>
+        <m:r>
+          <m:rPr>
+            <m:sty m:val="p"/>
+          </m:rPr>
+          <m:t>,</m:t>
+        </m:r>
+        <m:r>
+          <m:t>10</m:t>
+        </m:r>
+      </m:oMath>
+      <w:r>
+        <w:t xml:space="preserve"> </w:t>
+      </w:r>
+      <w:r>
+        <w:t xml:space="preserve">by an independent computational method, chosen specifically because building four more tables would have repeated the same method rather than tested it. Evidence now spans</w:t>
+      </w:r>
+      <w:r>
+        <w:t xml:space="preserve"> </w:t>
+      </w:r>
+      <m:oMath>
+        <m:r>
+          <m:t>k</m:t>
         </m:r>
         <m:r>
           <m:rPr>
@@ -21410,65 +23941,30 @@
           <m:t>=</m:t>
         </m:r>
         <m:r>
-          <m:t>1</m:t>
+          <m:t>0</m:t>
+        </m:r>
+        <m:r>
+          <m:rPr>
+            <m:sty m:val="p"/>
+          </m:rPr>
+          <m:t>…</m:t>
+        </m:r>
+        <m:r>
+          <m:t>10</m:t>
         </m:r>
       </m:oMath>
       <w:r>
-        <w:t xml:space="preserve">”</w:t>
-      </w:r>
-      <w:r>
-        <w:t xml:space="preserve"> </w:t>
-      </w:r>
-      <w:r>
-        <w:t xml:space="preserve">of the General Root Law.</w:t>
-      </w:r>
-      <w:r>
-        <w:t xml:space="preserve"> </w:t>
-      </w:r>
-      <w:r>
-        <w:rPr>
-          <w:bCs/>
-          <w:b/>
-        </w:rPr>
-        <w:t xml:space="preserve">That framing was wrong in emphasis</w:t>
-      </w:r>
-      <w:r>
-        <w:t xml:space="preserve">: within the Standard Power Base, which fixes the Prime String, the Root Theorem is unconditional and needs no qualification. Varying</w:t>
-      </w:r>
-      <w:r>
-        <w:t xml:space="preserve"> </w:t>
-      </w:r>
-      <m:oMath>
-        <m:r>
-          <m:t>a</m:t>
-        </m:r>
-      </m:oMath>
-      <w:r>
-        <w:t xml:space="preserve"> </w:t>
-      </w:r>
-      <w:r>
-        <w:t xml:space="preserve">or</w:t>
-      </w:r>
-      <w:r>
-        <w:t xml:space="preserve"> </w:t>
-      </w:r>
-      <m:oMath>
-        <m:r>
-          <m:t>d</m:t>
-        </m:r>
-      </m:oMath>
-      <w:r>
-        <w:t xml:space="preserve"> </w:t>
-      </w:r>
-      <w:r>
-        <w:t xml:space="preserve">leaves the Standard Power Base and produces a different Base String — a neighbouring question, not a caveat. §10 now says so explicitly, and §4.2 and §2.1 flag the distinction in advance.</w:t>
+        <w:t xml:space="preserve"> </w:t>
+      </w:r>
+      <w:r>
+        <w:t xml:space="preserve">by two routes.</w:t>
       </w:r>
     </w:p>
     <w:p>
       <w:pPr>
         <w:numPr>
           <w:ilvl w:val="0"/>
-          <w:numId w:val="1007"/>
+          <w:numId w:val="1008"/>
         </w:numPr>
         <w:pStyle w:val="Compact"/>
       </w:pPr>
@@ -21477,17 +23973,177 @@
           <w:bCs/>
           <w:b/>
         </w:rPr>
-        <w:t xml:space="preserve">§13.1 Exercise 7 added</w:t>
-      </w:r>
-      <w:r>
-        <w:t xml:space="preserve">, with answer — a direct exercise on the two reasoning errors above.</w:t>
+        <w:t xml:space="preserve">§9.6 added</w:t>
+      </w:r>
+      <w:r>
+        <w:t xml:space="preserve"> </w:t>
+      </w:r>
+      <w:r>
+        <w:t xml:space="preserve">— a second proof, by counting surjections, logically independent of the degree-descent proof.</w:t>
       </w:r>
     </w:p>
     <w:p>
       <w:pPr>
         <w:numPr>
           <w:ilvl w:val="0"/>
-          <w:numId w:val="1007"/>
+          <w:numId w:val="1008"/>
+        </w:numPr>
+        <w:pStyle w:val="Compact"/>
+      </w:pPr>
+      <w:r>
+        <w:rPr>
+          <w:bCs/>
+          <w:b/>
+        </w:rPr>
+        <w:t xml:space="preserve">§9.7 added</w:t>
+      </w:r>
+      <w:r>
+        <w:t xml:space="preserve"> </w:t>
+      </w:r>
+      <w:r>
+        <w:t xml:space="preserve">— on what independence of verification actually requires. Records honestly that four candidate proofs were assembled and only two proved independent, the other three being one argument in three notations.</w:t>
+      </w:r>
+    </w:p>
+    <w:p>
+      <w:pPr>
+        <w:numPr>
+          <w:ilvl w:val="0"/>
+          <w:numId w:val="1008"/>
+        </w:numPr>
+        <w:pStyle w:val="Compact"/>
+      </w:pPr>
+      <w:r>
+        <w:rPr>
+          <w:bCs/>
+          <w:b/>
+        </w:rPr>
+        <w:t xml:space="preserve">§10 reframed.</w:t>
+      </w:r>
+      <w:r>
+        <w:t xml:space="preserve"> </w:t>
+      </w:r>
+      <w:r>
+        <w:t xml:space="preserve">Version 1 presented the Root Theorem as</w:t>
+      </w:r>
+      <w:r>
+        <w:t xml:space="preserve"> </w:t>
+      </w:r>
+      <w:r>
+        <w:t xml:space="preserve">“</w:t>
+      </w:r>
+      <w:r>
+        <w:t xml:space="preserve">the special case</w:t>
+      </w:r>
+      <w:r>
+        <w:t xml:space="preserve"> </w:t>
+      </w:r>
+      <m:oMath>
+        <m:r>
+          <m:t>a</m:t>
+        </m:r>
+        <m:r>
+          <m:rPr>
+            <m:sty m:val="p"/>
+          </m:rPr>
+          <m:t>=</m:t>
+        </m:r>
+        <m:r>
+          <m:t>1</m:t>
+        </m:r>
+        <m:r>
+          <m:rPr>
+            <m:sty m:val="p"/>
+          </m:rPr>
+          <m:t>,</m:t>
+        </m:r>
+        <m:r>
+          <m:t>d</m:t>
+        </m:r>
+        <m:r>
+          <m:rPr>
+            <m:sty m:val="p"/>
+          </m:rPr>
+          <m:t>=</m:t>
+        </m:r>
+        <m:r>
+          <m:t>1</m:t>
+        </m:r>
+      </m:oMath>
+      <w:r>
+        <w:t xml:space="preserve">”</w:t>
+      </w:r>
+      <w:r>
+        <w:t xml:space="preserve"> </w:t>
+      </w:r>
+      <w:r>
+        <w:t xml:space="preserve">of the General Root Law.</w:t>
+      </w:r>
+      <w:r>
+        <w:t xml:space="preserve"> </w:t>
+      </w:r>
+      <w:r>
+        <w:rPr>
+          <w:bCs/>
+          <w:b/>
+        </w:rPr>
+        <w:t xml:space="preserve">That framing was wrong in emphasis</w:t>
+      </w:r>
+      <w:r>
+        <w:t xml:space="preserve">: within the Standard Power Base, which fixes the Prime String, the Root Theorem is unconditional and needs no qualification. Varying</w:t>
+      </w:r>
+      <w:r>
+        <w:t xml:space="preserve"> </w:t>
+      </w:r>
+      <m:oMath>
+        <m:r>
+          <m:t>a</m:t>
+        </m:r>
+      </m:oMath>
+      <w:r>
+        <w:t xml:space="preserve"> </w:t>
+      </w:r>
+      <w:r>
+        <w:t xml:space="preserve">or</w:t>
+      </w:r>
+      <w:r>
+        <w:t xml:space="preserve"> </w:t>
+      </w:r>
+      <m:oMath>
+        <m:r>
+          <m:t>d</m:t>
+        </m:r>
+      </m:oMath>
+      <w:r>
+        <w:t xml:space="preserve"> </w:t>
+      </w:r>
+      <w:r>
+        <w:t xml:space="preserve">leaves the Standard Power Base and produces a different Base String — a neighbouring question, not a caveat. §10 now says so explicitly, and §4.2 and §2.1 flag the distinction in advance.</w:t>
+      </w:r>
+    </w:p>
+    <w:p>
+      <w:pPr>
+        <w:numPr>
+          <w:ilvl w:val="0"/>
+          <w:numId w:val="1008"/>
+        </w:numPr>
+        <w:pStyle w:val="Compact"/>
+      </w:pPr>
+      <w:r>
+        <w:rPr>
+          <w:bCs/>
+          <w:b/>
+        </w:rPr>
+        <w:t xml:space="preserve">§13.1 Exercise 7 added</w:t>
+      </w:r>
+      <w:r>
+        <w:t xml:space="preserve">, with answer — a direct exercise on the two reasoning errors above.</w:t>
+      </w:r>
+    </w:p>
+    <w:p>
+      <w:pPr>
+        <w:numPr>
+          <w:ilvl w:val="0"/>
+          <w:numId w:val="1008"/>
         </w:numPr>
         <w:pStyle w:val="Compact"/>
       </w:pPr>
@@ -21920,6 +24576,36 @@
     </w:lvlOverride>
   </w:num>
   <w:num w:numId="1007">
+    <w:abstractNumId w:val="99411"/>
+    <w:lvlOverride w:ilvl="0">
+      <w:startOverride w:val="1"/>
+    </w:lvlOverride>
+    <w:lvlOverride w:ilvl="1">
+      <w:startOverride w:val="1"/>
+    </w:lvlOverride>
+    <w:lvlOverride w:ilvl="2">
+      <w:startOverride w:val="1"/>
+    </w:lvlOverride>
+    <w:lvlOverride w:ilvl="3">
+      <w:startOverride w:val="1"/>
+    </w:lvlOverride>
+    <w:lvlOverride w:ilvl="4">
+      <w:startOverride w:val="1"/>
+    </w:lvlOverride>
+    <w:lvlOverride w:ilvl="5">
+      <w:startOverride w:val="1"/>
+    </w:lvlOverride>
+    <w:lvlOverride w:ilvl="6">
+      <w:startOverride w:val="1"/>
+    </w:lvlOverride>
+    <w:lvlOverride w:ilvl="7">
+      <w:startOverride w:val="1"/>
+    </w:lvlOverride>
+    <w:lvlOverride w:ilvl="8">
+      <w:startOverride w:val="1"/>
+    </w:lvlOverride>
+  </w:num>
+  <w:num w:numId="1008">
     <w:abstractNumId w:val="99411"/>
     <w:lvlOverride w:ilvl="0">
       <w:startOverride w:val="1"/>

</xml_diff>